<commit_message>
Doc funcional Datasphere v2: consumo Power BI/SAC, real desde S/4HANA y propuesta recomendada
Actualiza el documento funcional de carga del presupuesto comercial: consumo en
Power BI o SAC; integración de datos reales desde SAP S/4HANA (Replication Flow
CDS/ODP) para reportes Real vs. Presupuesto; modelo destino con tablas
Presupuesto y Real y vista combinada; y una propuesta recomendada (mejor
opcion: Cloud Storage + Data Flow programado) con pasos de implementacion.
Nuevos flujogramas: arquitectura end-to-end y opcion recomendada.

Co-Authored-By: Claude Opus 4.8 <noreply@anthropic.com>
Claude-Session: https://claude.ai/code/session_0136eHscKSBqPfpX133QXv8e
</commit_message>
<xml_diff>
--- a/Documento_Funcional_Carga_Presupuesto_Comercial_Datasphere.docx
+++ b/Documento_Funcional_Carga_Presupuesto_Comercial_Datasphere.docx
@@ -92,9 +92,9 @@
           <w:rFonts w:ascii="Arial" w:hAnsi="Arial"/>
           <w:b w:val="0"/>
           <w:color w:val="1F3864"/>
-          <w:sz w:val="24"/>
+          <w:sz w:val="22"/>
         </w:rPr>
-        <w:t>Detalle de campos · Propuestas de arquitectura de carga</w:t>
+        <w:t>Real vs. Presupuesto · Consumo en Power BI o SAC · Propuestas de carga</w:t>
       </w:r>
     </w:p>
     <w:p>
@@ -178,7 +178,7 @@
                 <w:i w:val="0"/>
                 <w:sz w:val="19"/>
               </w:rPr>
-              <w:t>Carga del presupuesto comercial (multi-sociedad) a SAP Datasphere</w:t>
+              <w:t>Carga del presupuesto comercial a SAP Datasphere y reporte Real vs. Presupuesto</w:t>
             </w:r>
           </w:p>
         </w:tc>
@@ -236,7 +236,7 @@
                 <w:i w:val="0"/>
                 <w:sz w:val="19"/>
               </w:rPr>
-              <w:t>Archivo Excel «Campos para cargar presupuestos comerciales»</w:t>
+              <w:t>Presupuesto: archivo Excel de campos  ·  Real: SAP S/4HANA</w:t>
             </w:r>
           </w:p>
         </w:tc>
@@ -294,7 +294,7 @@
                 <w:i w:val="0"/>
                 <w:sz w:val="19"/>
               </w:rPr>
-              <w:t>SAP Datasphere (tabla local + vista) · consumo en SAP Analytics Cloud</w:t>
+              <w:t>SAP Datasphere (tablas + vista Real vs. Presupuesto)</w:t>
             </w:r>
           </w:p>
         </w:tc>
@@ -325,7 +325,7 @@
                 <w:color w:val="FFFFFF"/>
                 <w:sz w:val="19"/>
               </w:rPr>
-              <w:t>Sociedades</w:t>
+              <w:t>Consumo</w:t>
             </w:r>
           </w:p>
         </w:tc>
@@ -352,7 +352,7 @@
                 <w:i w:val="0"/>
                 <w:sz w:val="19"/>
               </w:rPr>
-              <w:t>Fanalca (8 líneas) · Metalsur · CGS · RH · Ciudad Limpia · Transprensa</w:t>
+              <w:t>Power BI o SAP Analytics Cloud (SAC)</w:t>
             </w:r>
           </w:p>
         </w:tc>
@@ -383,6 +383,64 @@
                 <w:color w:val="FFFFFF"/>
                 <w:sz w:val="19"/>
               </w:rPr>
+              <w:t>Sociedades</w:t>
+            </w:r>
+          </w:p>
+        </w:tc>
+        <w:tc>
+          <w:tcPr>
+            <w:tcW w:type="dxa" w:w="6048"/>
+            <w:vAlign w:val="center"/>
+            <w:tcMar>
+              <w:top w:w="40" w:type="dxa"/>
+              <w:bottom w:w="40" w:type="dxa"/>
+              <w:start w:w="80" w:type="dxa"/>
+              <w:end w:w="80" w:type="dxa"/>
+            </w:tcMar>
+          </w:tcPr>
+          <w:p>
+            <w:pPr>
+              <w:spacing w:after="20" w:before="20"/>
+              <w:jc w:val="left"/>
+            </w:pPr>
+            <w:r>
+              <w:rPr>
+                <w:rFonts w:ascii="Arial" w:hAnsi="Arial"/>
+                <w:b w:val="0"/>
+                <w:i w:val="0"/>
+                <w:sz w:val="19"/>
+              </w:rPr>
+              <w:t>Fanalca (8 líneas) · Metalsur · CGS · RH · Ciudad Limpia · Transprensa</w:t>
+            </w:r>
+          </w:p>
+        </w:tc>
+      </w:tr>
+      <w:tr>
+        <w:tc>
+          <w:tcPr>
+            <w:tcW w:type="dxa" w:w="2880"/>
+            <w:shd w:val="clear" w:color="auto" w:fill="1F3864"/>
+            <w:vAlign w:val="center"/>
+            <w:tcMar>
+              <w:top w:w="40" w:type="dxa"/>
+              <w:bottom w:w="40" w:type="dxa"/>
+              <w:start w:w="80" w:type="dxa"/>
+              <w:end w:w="80" w:type="dxa"/>
+            </w:tcMar>
+          </w:tcPr>
+          <w:p>
+            <w:pPr>
+              <w:spacing w:after="20" w:before="20"/>
+              <w:jc w:val="left"/>
+            </w:pPr>
+            <w:r>
+              <w:rPr>
+                <w:rFonts w:ascii="Arial" w:hAnsi="Arial"/>
+                <w:b/>
+                <w:i w:val="0"/>
+                <w:color w:val="FFFFFF"/>
+                <w:sz w:val="19"/>
+              </w:rPr>
               <w:t>Versión</w:t>
             </w:r>
           </w:p>
@@ -410,7 +468,7 @@
                 <w:i w:val="0"/>
                 <w:sz w:val="19"/>
               </w:rPr>
-              <w:t>1.0 — Borrador para revisión</w:t>
+              <w:t>2.0 — Borrador para revisión</w:t>
             </w:r>
           </w:p>
         </w:tc>
@@ -534,7 +592,7 @@
     </w:tbl>
     <w:p>
       <w:pPr>
-        <w:spacing w:after="480" w:before="0"/>
+        <w:spacing w:after="400" w:before="0"/>
       </w:pPr>
     </w:p>
     <w:p>
@@ -846,6 +904,120 @@
           </w:p>
         </w:tc>
       </w:tr>
+      <w:tr>
+        <w:tc>
+          <w:tcPr>
+            <w:tcW w:type="dxa" w:w="1152"/>
+            <w:vAlign w:val="center"/>
+            <w:tcMar>
+              <w:top w:w="40" w:type="dxa"/>
+              <w:bottom w:w="40" w:type="dxa"/>
+              <w:start w:w="80" w:type="dxa"/>
+              <w:end w:w="80" w:type="dxa"/>
+            </w:tcMar>
+            <w:shd w:val="clear" w:color="auto" w:fill="F2F6FC"/>
+          </w:tcPr>
+          <w:p>
+            <w:pPr>
+              <w:spacing w:after="20" w:before="20"/>
+              <w:jc w:val="left"/>
+            </w:pPr>
+            <w:r>
+              <w:rPr>
+                <w:rFonts w:ascii="Arial" w:hAnsi="Arial"/>
+                <w:b w:val="0"/>
+                <w:i w:val="0"/>
+                <w:sz w:val="17"/>
+              </w:rPr>
+              <w:t>2.0</w:t>
+            </w:r>
+          </w:p>
+        </w:tc>
+        <w:tc>
+          <w:tcPr>
+            <w:tcW w:type="dxa" w:w="1584"/>
+            <w:vAlign w:val="center"/>
+            <w:tcMar>
+              <w:top w:w="40" w:type="dxa"/>
+              <w:bottom w:w="40" w:type="dxa"/>
+              <w:start w:w="80" w:type="dxa"/>
+              <w:end w:w="80" w:type="dxa"/>
+            </w:tcMar>
+            <w:shd w:val="clear" w:color="auto" w:fill="F2F6FC"/>
+          </w:tcPr>
+          <w:p>
+            <w:pPr>
+              <w:spacing w:after="20" w:before="20"/>
+              <w:jc w:val="left"/>
+            </w:pPr>
+            <w:r>
+              <w:rPr>
+                <w:rFonts w:ascii="Arial" w:hAnsi="Arial"/>
+                <w:b w:val="0"/>
+                <w:i w:val="0"/>
+                <w:sz w:val="17"/>
+              </w:rPr>
+              <w:t>(fecha)</w:t>
+            </w:r>
+          </w:p>
+        </w:tc>
+        <w:tc>
+          <w:tcPr>
+            <w:tcW w:type="dxa" w:w="2304"/>
+            <w:vAlign w:val="center"/>
+            <w:tcMar>
+              <w:top w:w="40" w:type="dxa"/>
+              <w:bottom w:w="40" w:type="dxa"/>
+              <w:start w:w="80" w:type="dxa"/>
+              <w:end w:w="80" w:type="dxa"/>
+            </w:tcMar>
+            <w:shd w:val="clear" w:color="auto" w:fill="F2F6FC"/>
+          </w:tcPr>
+          <w:p>
+            <w:pPr>
+              <w:spacing w:after="20" w:before="20"/>
+              <w:jc w:val="left"/>
+            </w:pPr>
+            <w:r>
+              <w:rPr>
+                <w:rFonts w:ascii="Arial" w:hAnsi="Arial"/>
+                <w:b w:val="0"/>
+                <w:i w:val="0"/>
+                <w:sz w:val="17"/>
+              </w:rPr>
+              <w:t>Equipo SAP BUILD</w:t>
+            </w:r>
+          </w:p>
+        </w:tc>
+        <w:tc>
+          <w:tcPr>
+            <w:tcW w:type="dxa" w:w="4464"/>
+            <w:vAlign w:val="center"/>
+            <w:tcMar>
+              <w:top w:w="40" w:type="dxa"/>
+              <w:bottom w:w="40" w:type="dxa"/>
+              <w:start w:w="80" w:type="dxa"/>
+              <w:end w:w="80" w:type="dxa"/>
+            </w:tcMar>
+            <w:shd w:val="clear" w:color="auto" w:fill="F2F6FC"/>
+          </w:tcPr>
+          <w:p>
+            <w:pPr>
+              <w:spacing w:after="20" w:before="20"/>
+              <w:jc w:val="left"/>
+            </w:pPr>
+            <w:r>
+              <w:rPr>
+                <w:rFonts w:ascii="Arial" w:hAnsi="Arial"/>
+                <w:b w:val="0"/>
+                <w:i w:val="0"/>
+                <w:sz w:val="17"/>
+              </w:rPr>
+              <w:t>Consumo en Power BI/SAC; integración del real desde S/4HANA (Real vs. Presupuesto); propuesta recomendada</w:t>
+            </w:r>
+          </w:p>
+        </w:tc>
+      </w:tr>
     </w:tbl>
     <w:p>
       <w:pPr>
@@ -1204,7 +1376,7 @@
           <w:i w:val="0"/>
           <w:sz w:val="20"/>
         </w:rPr>
-        <w:t>Definir, a nivel funcional, cómo cargar el presupuesto comercial de las sociedades del Grupo Fanalca en SAP Datasphere, a partir del archivo de detalle de campos, y presentar varias propuestas de arquitectura para llevar ese archivo directamente a SAP Datasphere, con sus ventajas, limitaciones y una recomendación.</w:t>
+        <w:t>Definir, a nivel funcional, cómo cargar el presupuesto comercial de las sociedades del Grupo Fanalca en SAP Datasphere y cómo integrar los datos reales desde SAP S/4HANA, de modo que se puedan generar reportes de ejecución (Real) frente al Presupuesto. El consumo de la información se realiza en Power BI o en SAP Analytics Cloud (SAC). Adicionalmente, se presentan varias propuestas de carga del archivo y una propuesta recomendada (mejor opción).</w:t>
       </w:r>
     </w:p>
     <w:p>
@@ -1219,7 +1391,7 @@
           <w:i w:val="0"/>
           <w:sz w:val="19"/>
         </w:rPr>
-        <w:t>Alcance. Cubre la descripción del origen (campos y aplicabilidad por sociedad), el modelo de datos destino en Datasphere, y cuatro opciones de carga (manual, almacenamiento en la nube, esquema Open SQL y orquestación con Integration Suite). El consumo posterior (modelos y reportes) se realiza en SAP Analytics Cloud y se aborda en el documento de diseño (DOC-01).</w:t>
+        <w:t>Alcance. Cubre: la arquitectura general; la descripción del origen (campos y aplicabilidad por sociedad); la integración del real desde S/4HANA; el modelo de datos destino (presupuesto, real y vista Real vs. Presupuesto); las opciones de carga del archivo con sus flujogramas; la propuesta recomendada; y el consumo en Power BI o SAC.</w:t>
       </w:r>
     </w:p>
     <w:p>
@@ -1229,7 +1401,7 @@
         <w:spacing w:before="280" w:after="120"/>
       </w:pPr>
       <w:r>
-        <w:t>Descripción del origen: el presupuesto comercial</w:t>
+        <w:t>Arquitectura general</w:t>
       </w:r>
     </w:p>
     <w:p>
@@ -1244,104 +1416,88 @@
           <w:i w:val="0"/>
           <w:sz w:val="20"/>
         </w:rPr>
-        <w:t>El archivo fuente define los campos del presupuesto comercial y su aplicabilidad por sociedad y línea de negocio, mediante una matriz en la que se marca con «x» cada campo que aplica a cada organización. Las organizaciones son: Fanalca (Autos Nuevos y Usados, Autos Servicios/Repuestos, Motos, Motos Repuestos, Tubos, Defensas, Carrocerías, Autopartes), Metalsur, CGS, RH, Ciudad Limpia (las 3) y Transprensa.</w:t>
+        <w:t>La solución integra dos fuentes en SAP Datasphere: el presupuesto comercial (desde el archivo) y los datos reales (desde SAP S/4HANA). Ambos se materializan como tablas en un mismo Space y se combinan en una vista analítica «Real vs. Presupuesto», alineada por sociedad, periodo y dimensiones comunes. El consumo se realiza indistintamente en Power BI o en SAP Analytics Cloud, lo que permite generar los reportes de real frente a presupuesto.</w:t>
       </w:r>
     </w:p>
-    <w:tbl>
-      <w:tblPr>
-        <w:tblStyle w:val="TableGrid"/>
-        <w:tblW w:type="auto" w:w="0"/>
+    <w:p>
+      <w:pPr>
+        <w:spacing w:before="120" w:after="40"/>
         <w:jc w:val="center"/>
-        <w:tblLayout w:type="fixed"/>
-        <w:tblLook w:firstColumn="1" w:firstRow="1" w:lastColumn="0" w:lastRow="0" w:noHBand="0" w:noVBand="1" w:val="04A0"/>
-        <w:tblLayout w:type="fixed"/>
-        <w:tblBorders>
-          <w:top w:val="single" w:sz="8" w:space="0" w:color="2E5496"/>
-          <w:left w:val="single" w:sz="8" w:space="0" w:color="2E5496"/>
-          <w:bottom w:val="single" w:sz="8" w:space="0" w:color="2E5496"/>
-          <w:right w:val="single" w:sz="8" w:space="0" w:color="2E5496"/>
-          <w:insideH w:val="single" w:sz="8" w:space="0" w:color="2E5496"/>
-          <w:insideV w:val="single" w:sz="8" w:space="0" w:color="2E5496"/>
-        </w:tblBorders>
-      </w:tblPr>
-      <w:tblGrid>
-        <w:gridCol w:w="9506"/>
-      </w:tblGrid>
-      <w:tr>
-        <w:tc>
-          <w:tcPr>
-            <w:tcW w:type="dxa" w:w="9504"/>
-            <w:shd w:val="clear" w:color="auto" w:fill="2E5496"/>
-            <w:vAlign w:val="center"/>
-            <w:tcMar>
-              <w:top w:w="50" w:type="dxa"/>
-              <w:bottom w:w="50" w:type="dxa"/>
-              <w:start w:w="80" w:type="dxa"/>
-              <w:end w:w="80" w:type="dxa"/>
-            </w:tcMar>
-          </w:tcPr>
-          <w:p>
-            <w:pPr>
-              <w:spacing w:after="20" w:before="20"/>
-              <w:jc w:val="left"/>
-            </w:pPr>
-            <w:r>
-              <w:rPr>
-                <w:rFonts w:ascii="Arial" w:hAnsi="Arial"/>
-                <w:b/>
-                <w:i w:val="0"/>
-                <w:color w:val="FFFFFF"/>
-                <w:sz w:val="18"/>
-              </w:rPr>
-              <w:t>●  Naturaleza del dato</w:t>
-            </w:r>
-          </w:p>
-        </w:tc>
-      </w:tr>
-      <w:tr>
-        <w:tc>
-          <w:tcPr>
-            <w:tcW w:type="dxa" w:w="9504"/>
-            <w:shd w:val="clear" w:color="auto" w:fill="EAF1FB"/>
-            <w:vAlign w:val="center"/>
-            <w:tcMar>
-              <w:top w:w="60" w:type="dxa"/>
-              <w:bottom w:w="60" w:type="dxa"/>
-              <w:start w:w="80" w:type="dxa"/>
-              <w:end w:w="80" w:type="dxa"/>
-            </w:tcMar>
-          </w:tcPr>
-          <w:p>
-            <w:pPr>
-              <w:spacing w:after="40" w:before="0"/>
-            </w:pPr>
-            <w:r>
-              <w:rPr>
-                <w:rFonts w:ascii="Arial" w:hAnsi="Arial"/>
-                <w:sz w:val="17"/>
-              </w:rPr>
-              <w:t>▸  El presupuesto comercial se compone de registros con una combinación de dimensiones (canal, sector, cliente, material, vendedor, etc.) más el periodo (Año y Mes) y las medidas Cantidad y Valor.</w:t>
-            </w:r>
-          </w:p>
-          <w:p>
-            <w:pPr>
-              <w:spacing w:after="40" w:before="0"/>
-            </w:pPr>
-            <w:r>
-              <w:rPr>
-                <w:rFonts w:ascii="Arial" w:hAnsi="Arial"/>
-                <w:sz w:val="17"/>
-              </w:rPr>
-              <w:t>▸  No todos los campos aplican a todas las organizaciones: la matriz del archivo indica la aplicabilidad. El modelo destino contempla todos los campos y se poblan según corresponda a cada sociedad.</w:t>
-            </w:r>
-          </w:p>
-        </w:tc>
-      </w:tr>
-    </w:tbl>
+      </w:pPr>
+      <w:r>
+        <w:drawing>
+          <wp:inline>
+            <wp:extent cx="6035040" cy="3142489"/>
+            <wp:docPr id="3" name="Picture 3"/>
+            <wp:cNvGraphicFramePr>
+              <a:graphicFrameLocks noChangeAspect="1"/>
+            </wp:cNvGraphicFramePr>
+            <a:graphic>
+              <a:graphicData uri="http://schemas.openxmlformats.org/drawingml/2006/picture">
+                <pic:pic>
+                  <pic:nvPicPr>
+                    <pic:cNvPr id="0" name="arch_e2e.png"/>
+                    <pic:cNvPicPr/>
+                  </pic:nvPicPr>
+                  <pic:blipFill>
+                    <a:blip r:embed="rId27"/>
+                    <a:stretch>
+                      <a:fillRect/>
+                    </a:stretch>
+                  </pic:blipFill>
+                  <pic:spPr>
+                    <a:xfrm>
+                      <a:off x="0" y="0"/>
+                      <a:ext cx="6035040" cy="3142489"/>
+                    </a:xfrm>
+                    <a:prstGeom prst="rect"/>
+                  </pic:spPr>
+                </pic:pic>
+              </a:graphicData>
+            </a:graphic>
+          </wp:inline>
+        </w:drawing>
+      </w:r>
+    </w:p>
     <w:p>
       <w:pPr>
-        <w:spacing w:after="120" w:before="0"/>
-      </w:pPr>
+        <w:spacing w:after="200"/>
+        <w:jc w:val="center"/>
+      </w:pPr>
+      <w:r>
+        <w:rPr>
+          <w:rFonts w:ascii="Arial" w:hAnsi="Arial"/>
+          <w:i/>
+          <w:color w:val="595959"/>
+          <w:sz w:val="17"/>
+        </w:rPr>
+        <w:t>Figura 1. Arquitectura end-to-end: presupuesto (archivo) y real (S/4HANA) → Real vs. Presupuesto → Power BI o SAC.</w:t>
+      </w:r>
+    </w:p>
+    <w:p>
+      <w:pPr>
+        <w:pStyle w:val="Heading1"/>
+        <w:keepNext/>
+        <w:spacing w:before="280" w:after="120"/>
+      </w:pPr>
+      <w:r>
+        <w:t>Descripción del origen: el presupuesto comercial</w:t>
+      </w:r>
+    </w:p>
+    <w:p>
+      <w:pPr>
+        <w:spacing w:after="120"/>
+        <w:jc w:val="both"/>
+      </w:pPr>
+      <w:r>
+        <w:rPr>
+          <w:rFonts w:ascii="Arial" w:hAnsi="Arial"/>
+          <w:b w:val="0"/>
+          <w:i w:val="0"/>
+          <w:sz w:val="20"/>
+        </w:rPr>
+        <w:t>El archivo fuente define los campos del presupuesto comercial y su aplicabilidad por sociedad y línea de negocio mediante una matriz que marca con «x» cada campo que aplica a cada organización. Las organizaciones son: Fanalca (Autos Nuevos y Usados, Autos Servicios/Repuestos, Motos, Motos Repuestos, Tubos, Defensas, Carrocerías, Autopartes), Metalsur, CGS, RH, Ciudad Limpia (las 3) y Transprensa. Cada registro combina dimensiones (canal, sector, cliente, material, vendedor, etc.) más el periodo (Año y Mes) y las medidas Cantidad y Valor.</w:t>
+      </w:r>
     </w:p>
     <w:p>
       <w:pPr>
@@ -4608,7 +4764,7 @@
           <w:color w:val="595959"/>
           <w:sz w:val="18"/>
         </w:rPr>
-        <w:t>Nota: la aplicabilidad se derivó de la matriz del archivo fuente. El detalle completo por organización se conserva en dicho archivo (DOC-02).</w:t>
+        <w:t>Nota: la aplicabilidad se derivó de la matriz del archivo fuente; el detalle completo por organización se conserva en dicho archivo (DOC-02).</w:t>
       </w:r>
     </w:p>
     <w:p>
@@ -4618,7 +4774,7 @@
         <w:spacing w:before="280" w:after="120"/>
       </w:pPr>
       <w:r>
-        <w:t>Modelo de datos destino en SAP Datasphere</w:t>
+        <w:t>Integración de datos reales desde SAP S/4HANA</w:t>
       </w:r>
     </w:p>
     <w:p>
@@ -4633,7 +4789,432 @@
           <w:i w:val="0"/>
           <w:sz w:val="20"/>
         </w:rPr>
-        <w:t>Se propone una tabla local (de hechos) en el Space de Datasphere que contenga todas las dimensiones y medidas, más columnas de control. Los campos no aplicables a una organización quedan vacíos. Sobre la tabla se construye una vista analítica para el consumo en SAC.</w:t>
+        <w:t>Para comparar la ejecución contra el presupuesto, los datos reales se integran desde SAP S/4HANA hacia SAP Datasphere. La ingesta se realiza mediante una conexión a S/4HANA y un Replication Flow (o Data Flow) que extrae la información financiera/comercial —por ejemplo, desde el documento contable (ACDOCA) o desde vistas CDS analíticas habilitadas para extracción vía ODP/CDS—. El real se materializa como una «Tabla Real» en el mismo Space del presupuesto.</w:t>
+      </w:r>
+    </w:p>
+    <w:tbl>
+      <w:tblPr>
+        <w:tblStyle w:val="Fanalca"/>
+        <w:tblW w:type="auto" w:w="0"/>
+        <w:jc w:val="center"/>
+        <w:tblLayout w:type="fixed"/>
+        <w:tblLook w:firstColumn="1" w:firstRow="1" w:lastColumn="0" w:lastRow="0" w:noHBand="0" w:noVBand="1" w:val="04A0"/>
+        <w:tblLayout w:type="fixed"/>
+      </w:tblPr>
+      <w:tblGrid>
+        <w:gridCol w:w="3169"/>
+        <w:gridCol w:w="3169"/>
+        <w:gridCol w:w="3169"/>
+      </w:tblGrid>
+      <w:tr>
+        <w:trPr>
+          <w:tblHeader w:val="true"/>
+          <w:cantSplit w:val="true"/>
+        </w:trPr>
+        <w:tc>
+          <w:tcPr>
+            <w:tcW w:type="dxa" w:w="2448"/>
+            <w:shd w:val="clear" w:color="auto" w:fill="1F3864"/>
+            <w:vAlign w:val="center"/>
+            <w:tcMar>
+              <w:top w:w="40" w:type="dxa"/>
+              <w:bottom w:w="40" w:type="dxa"/>
+              <w:start w:w="80" w:type="dxa"/>
+              <w:end w:w="80" w:type="dxa"/>
+            </w:tcMar>
+          </w:tcPr>
+          <w:p>
+            <w:pPr>
+              <w:spacing w:after="20" w:before="20"/>
+              <w:jc w:val="center"/>
+            </w:pPr>
+            <w:r>
+              <w:rPr>
+                <w:rFonts w:ascii="Arial" w:hAnsi="Arial"/>
+                <w:b/>
+                <w:i w:val="0"/>
+                <w:color w:val="FFFFFF"/>
+                <w:sz w:val="17"/>
+              </w:rPr>
+              <w:t>Modo de integración</w:t>
+            </w:r>
+          </w:p>
+        </w:tc>
+        <w:tc>
+          <w:tcPr>
+            <w:tcW w:type="dxa" w:w="4176"/>
+            <w:shd w:val="clear" w:color="auto" w:fill="1F3864"/>
+            <w:vAlign w:val="center"/>
+            <w:tcMar>
+              <w:top w:w="40" w:type="dxa"/>
+              <w:bottom w:w="40" w:type="dxa"/>
+              <w:start w:w="80" w:type="dxa"/>
+              <w:end w:w="80" w:type="dxa"/>
+            </w:tcMar>
+          </w:tcPr>
+          <w:p>
+            <w:pPr>
+              <w:spacing w:after="20" w:before="20"/>
+              <w:jc w:val="center"/>
+            </w:pPr>
+            <w:r>
+              <w:rPr>
+                <w:rFonts w:ascii="Arial" w:hAnsi="Arial"/>
+                <w:b/>
+                <w:i w:val="0"/>
+                <w:color w:val="FFFFFF"/>
+                <w:sz w:val="17"/>
+              </w:rPr>
+              <w:t>Descripción</w:t>
+            </w:r>
+          </w:p>
+        </w:tc>
+        <w:tc>
+          <w:tcPr>
+            <w:tcW w:type="dxa" w:w="2880"/>
+            <w:shd w:val="clear" w:color="auto" w:fill="1F3864"/>
+            <w:vAlign w:val="center"/>
+            <w:tcMar>
+              <w:top w:w="40" w:type="dxa"/>
+              <w:bottom w:w="40" w:type="dxa"/>
+              <w:start w:w="80" w:type="dxa"/>
+              <w:end w:w="80" w:type="dxa"/>
+            </w:tcMar>
+          </w:tcPr>
+          <w:p>
+            <w:pPr>
+              <w:spacing w:after="20" w:before="20"/>
+              <w:jc w:val="center"/>
+            </w:pPr>
+            <w:r>
+              <w:rPr>
+                <w:rFonts w:ascii="Arial" w:hAnsi="Arial"/>
+                <w:b/>
+                <w:i w:val="0"/>
+                <w:color w:val="FFFFFF"/>
+                <w:sz w:val="17"/>
+              </w:rPr>
+              <w:t>Cuándo usarlo</w:t>
+            </w:r>
+          </w:p>
+        </w:tc>
+      </w:tr>
+      <w:tr>
+        <w:tc>
+          <w:tcPr>
+            <w:tcW w:type="dxa" w:w="2448"/>
+            <w:vAlign w:val="center"/>
+            <w:tcMar>
+              <w:top w:w="40" w:type="dxa"/>
+              <w:bottom w:w="40" w:type="dxa"/>
+              <w:start w:w="80" w:type="dxa"/>
+              <w:end w:w="80" w:type="dxa"/>
+            </w:tcMar>
+          </w:tcPr>
+          <w:p>
+            <w:pPr>
+              <w:spacing w:after="20" w:before="20"/>
+              <w:jc w:val="left"/>
+            </w:pPr>
+            <w:r>
+              <w:rPr>
+                <w:rFonts w:ascii="Arial" w:hAnsi="Arial"/>
+                <w:b w:val="0"/>
+                <w:i w:val="0"/>
+                <w:sz w:val="16"/>
+              </w:rPr>
+              <w:t>Replicación (Replication Flow)</w:t>
+            </w:r>
+          </w:p>
+        </w:tc>
+        <w:tc>
+          <w:tcPr>
+            <w:tcW w:type="dxa" w:w="4176"/>
+            <w:vAlign w:val="center"/>
+            <w:tcMar>
+              <w:top w:w="40" w:type="dxa"/>
+              <w:bottom w:w="40" w:type="dxa"/>
+              <w:start w:w="80" w:type="dxa"/>
+              <w:end w:w="80" w:type="dxa"/>
+            </w:tcMar>
+          </w:tcPr>
+          <w:p>
+            <w:pPr>
+              <w:spacing w:after="20" w:before="20"/>
+              <w:jc w:val="left"/>
+            </w:pPr>
+            <w:r>
+              <w:rPr>
+                <w:rFonts w:ascii="Arial" w:hAnsi="Arial"/>
+                <w:b w:val="0"/>
+                <w:i w:val="0"/>
+                <w:sz w:val="16"/>
+              </w:rPr>
+              <w:t>Copia programada de los datos a una tabla en Datasphere (snapshot o delta).</w:t>
+            </w:r>
+          </w:p>
+        </w:tc>
+        <w:tc>
+          <w:tcPr>
+            <w:tcW w:type="dxa" w:w="2880"/>
+            <w:vAlign w:val="center"/>
+            <w:tcMar>
+              <w:top w:w="40" w:type="dxa"/>
+              <w:bottom w:w="40" w:type="dxa"/>
+              <w:start w:w="80" w:type="dxa"/>
+              <w:end w:w="80" w:type="dxa"/>
+            </w:tcMar>
+          </w:tcPr>
+          <w:p>
+            <w:pPr>
+              <w:spacing w:after="20" w:before="20"/>
+              <w:jc w:val="left"/>
+            </w:pPr>
+            <w:r>
+              <w:rPr>
+                <w:rFonts w:ascii="Arial" w:hAnsi="Arial"/>
+                <w:b w:val="0"/>
+                <w:i w:val="0"/>
+                <w:sz w:val="16"/>
+              </w:rPr>
+              <w:t>Recomendado: mejor desempeño y desacople de S/4HANA para el reporte.</w:t>
+            </w:r>
+          </w:p>
+        </w:tc>
+      </w:tr>
+      <w:tr>
+        <w:tc>
+          <w:tcPr>
+            <w:tcW w:type="dxa" w:w="2448"/>
+            <w:vAlign w:val="center"/>
+            <w:tcMar>
+              <w:top w:w="40" w:type="dxa"/>
+              <w:bottom w:w="40" w:type="dxa"/>
+              <w:start w:w="80" w:type="dxa"/>
+              <w:end w:w="80" w:type="dxa"/>
+            </w:tcMar>
+            <w:shd w:val="clear" w:color="auto" w:fill="F2F6FC"/>
+          </w:tcPr>
+          <w:p>
+            <w:pPr>
+              <w:spacing w:after="20" w:before="20"/>
+              <w:jc w:val="left"/>
+            </w:pPr>
+            <w:r>
+              <w:rPr>
+                <w:rFonts w:ascii="Arial" w:hAnsi="Arial"/>
+                <w:b w:val="0"/>
+                <w:i w:val="0"/>
+                <w:sz w:val="16"/>
+              </w:rPr>
+              <w:t>Federación (vista remota)</w:t>
+            </w:r>
+          </w:p>
+        </w:tc>
+        <w:tc>
+          <w:tcPr>
+            <w:tcW w:type="dxa" w:w="4176"/>
+            <w:vAlign w:val="center"/>
+            <w:tcMar>
+              <w:top w:w="40" w:type="dxa"/>
+              <w:bottom w:w="40" w:type="dxa"/>
+              <w:start w:w="80" w:type="dxa"/>
+              <w:end w:w="80" w:type="dxa"/>
+            </w:tcMar>
+            <w:shd w:val="clear" w:color="auto" w:fill="F2F6FC"/>
+          </w:tcPr>
+          <w:p>
+            <w:pPr>
+              <w:spacing w:after="20" w:before="20"/>
+              <w:jc w:val="left"/>
+            </w:pPr>
+            <w:r>
+              <w:rPr>
+                <w:rFonts w:ascii="Arial" w:hAnsi="Arial"/>
+                <w:b w:val="0"/>
+                <w:i w:val="0"/>
+                <w:sz w:val="16"/>
+              </w:rPr>
+              <w:t>Acceso en tiempo real a S/4HANA sin persistir los datos.</w:t>
+            </w:r>
+          </w:p>
+        </w:tc>
+        <w:tc>
+          <w:tcPr>
+            <w:tcW w:type="dxa" w:w="2880"/>
+            <w:vAlign w:val="center"/>
+            <w:tcMar>
+              <w:top w:w="40" w:type="dxa"/>
+              <w:bottom w:w="40" w:type="dxa"/>
+              <w:start w:w="80" w:type="dxa"/>
+              <w:end w:w="80" w:type="dxa"/>
+            </w:tcMar>
+            <w:shd w:val="clear" w:color="auto" w:fill="F2F6FC"/>
+          </w:tcPr>
+          <w:p>
+            <w:pPr>
+              <w:spacing w:after="20" w:before="20"/>
+              <w:jc w:val="left"/>
+            </w:pPr>
+            <w:r>
+              <w:rPr>
+                <w:rFonts w:ascii="Arial" w:hAnsi="Arial"/>
+                <w:b w:val="0"/>
+                <w:i w:val="0"/>
+                <w:sz w:val="16"/>
+              </w:rPr>
+              <w:t>Cuando se requiere el dato más reciente y el volumen/latencia lo permiten.</w:t>
+            </w:r>
+          </w:p>
+        </w:tc>
+      </w:tr>
+    </w:tbl>
+    <w:p>
+      <w:pPr>
+        <w:spacing w:after="80" w:before="0"/>
+      </w:pPr>
+    </w:p>
+    <w:tbl>
+      <w:tblPr>
+        <w:tblStyle w:val="TableGrid"/>
+        <w:tblW w:type="auto" w:w="0"/>
+        <w:jc w:val="center"/>
+        <w:tblLayout w:type="fixed"/>
+        <w:tblLook w:firstColumn="1" w:firstRow="1" w:lastColumn="0" w:lastRow="0" w:noHBand="0" w:noVBand="1" w:val="04A0"/>
+        <w:tblLayout w:type="fixed"/>
+        <w:tblBorders>
+          <w:top w:val="single" w:sz="8" w:space="0" w:color="C00000"/>
+          <w:left w:val="single" w:sz="8" w:space="0" w:color="C00000"/>
+          <w:bottom w:val="single" w:sz="8" w:space="0" w:color="C00000"/>
+          <w:right w:val="single" w:sz="8" w:space="0" w:color="C00000"/>
+          <w:insideH w:val="single" w:sz="8" w:space="0" w:color="C00000"/>
+          <w:insideV w:val="single" w:sz="8" w:space="0" w:color="C00000"/>
+        </w:tblBorders>
+      </w:tblPr>
+      <w:tblGrid>
+        <w:gridCol w:w="9506"/>
+      </w:tblGrid>
+      <w:tr>
+        <w:tc>
+          <w:tcPr>
+            <w:tcW w:type="dxa" w:w="9504"/>
+            <w:shd w:val="clear" w:color="auto" w:fill="C00000"/>
+            <w:vAlign w:val="center"/>
+            <w:tcMar>
+              <w:top w:w="50" w:type="dxa"/>
+              <w:bottom w:w="50" w:type="dxa"/>
+              <w:start w:w="80" w:type="dxa"/>
+              <w:end w:w="80" w:type="dxa"/>
+            </w:tcMar>
+          </w:tcPr>
+          <w:p>
+            <w:pPr>
+              <w:spacing w:after="20" w:before="20"/>
+              <w:jc w:val="left"/>
+            </w:pPr>
+            <w:r>
+              <w:rPr>
+                <w:rFonts w:ascii="Arial" w:hAnsi="Arial"/>
+                <w:b/>
+                <w:i w:val="0"/>
+                <w:color w:val="FFFFFF"/>
+                <w:sz w:val="18"/>
+              </w:rPr>
+              <w:t>●  Requisitos y armonización</w:t>
+            </w:r>
+          </w:p>
+        </w:tc>
+      </w:tr>
+      <w:tr>
+        <w:tc>
+          <w:tcPr>
+            <w:tcW w:type="dxa" w:w="9504"/>
+            <w:shd w:val="clear" w:color="auto" w:fill="FDECEA"/>
+            <w:vAlign w:val="center"/>
+            <w:tcMar>
+              <w:top w:w="60" w:type="dxa"/>
+              <w:bottom w:w="60" w:type="dxa"/>
+              <w:start w:w="80" w:type="dxa"/>
+              <w:end w:w="80" w:type="dxa"/>
+            </w:tcMar>
+          </w:tcPr>
+          <w:p>
+            <w:pPr>
+              <w:spacing w:after="40" w:before="0"/>
+            </w:pPr>
+            <w:r>
+              <w:rPr>
+                <w:rFonts w:ascii="Arial" w:hAnsi="Arial"/>
+                <w:sz w:val="17"/>
+              </w:rPr>
+              <w:t>▸  Conexión a S/4HANA (con SAP Cloud Connector si es on-premise) y autorizaciones de extracción.</w:t>
+            </w:r>
+          </w:p>
+          <w:p>
+            <w:pPr>
+              <w:spacing w:after="40" w:before="0"/>
+            </w:pPr>
+            <w:r>
+              <w:rPr>
+                <w:rFonts w:ascii="Arial" w:hAnsi="Arial"/>
+                <w:sz w:val="17"/>
+              </w:rPr>
+              <w:t>▸  Vistas CDS habilitadas para extracción (ODP) o acceso a las tablas/vistas del real.</w:t>
+            </w:r>
+          </w:p>
+          <w:p>
+            <w:pPr>
+              <w:spacing w:after="40" w:before="0"/>
+            </w:pPr>
+            <w:r>
+              <w:rPr>
+                <w:rFonts w:ascii="Arial" w:hAnsi="Arial"/>
+                <w:sz w:val="17"/>
+              </w:rPr>
+              <w:t>▸  Armonizar las dimensiones comunes entre real y presupuesto —sociedad, periodo (año/mes) y las llaves de negocio pertinentes (cuenta, material, cliente, centro)— para el comparativo.</w:t>
+            </w:r>
+          </w:p>
+        </w:tc>
+      </w:tr>
+    </w:tbl>
+    <w:p>
+      <w:pPr>
+        <w:spacing w:after="120" w:before="0"/>
+      </w:pPr>
+    </w:p>
+    <w:p>
+      <w:pPr>
+        <w:pStyle w:val="Heading1"/>
+        <w:keepNext/>
+        <w:spacing w:before="280" w:after="120"/>
+      </w:pPr>
+      <w:r>
+        <w:t>Modelo de datos destino en SAP Datasphere</w:t>
+      </w:r>
+    </w:p>
+    <w:p>
+      <w:pPr>
+        <w:spacing w:after="120"/>
+        <w:jc w:val="both"/>
+      </w:pPr>
+      <w:r>
+        <w:rPr>
+          <w:rFonts w:ascii="Arial" w:hAnsi="Arial"/>
+          <w:b w:val="0"/>
+          <w:i w:val="0"/>
+          <w:sz w:val="20"/>
+        </w:rPr>
+        <w:t>En el Space se definen dos tablas —Presupuesto y Real— con dimensiones y medidas armonizadas, y una vista analítica que las combina para el reporte Real vs. Presupuesto. La dimensión «Versión» distingue el origen (Presupuesto / Real).</w:t>
+      </w:r>
+    </w:p>
+    <w:p>
+      <w:pPr>
+        <w:pStyle w:val="Heading2"/>
+        <w:keepNext/>
+        <w:spacing w:before="200" w:after="80"/>
+      </w:pPr>
+      <w:r>
+        <w:t>Tabla de Presupuesto (desde el archivo)</w:t>
       </w:r>
     </w:p>
     <w:tbl>
@@ -4716,7 +5297,7 @@
         </w:tc>
         <w:tc>
           <w:tcPr>
-            <w:tcW w:type="dxa" w:w="2016"/>
+            <w:tcW w:type="dxa" w:w="2160"/>
             <w:shd w:val="clear" w:color="auto" w:fill="1F3864"/>
             <w:vAlign w:val="center"/>
             <w:tcMar>
@@ -4745,7 +5326,7 @@
         </w:tc>
         <w:tc>
           <w:tcPr>
-            <w:tcW w:type="dxa" w:w="1296"/>
+            <w:tcW w:type="dxa" w:w="1152"/>
             <w:shd w:val="clear" w:color="auto" w:fill="1F3864"/>
             <w:vAlign w:val="center"/>
             <w:tcMar>
@@ -4830,7 +5411,7 @@
         </w:tc>
         <w:tc>
           <w:tcPr>
-            <w:tcW w:type="dxa" w:w="2016"/>
+            <w:tcW w:type="dxa" w:w="2160"/>
             <w:vAlign w:val="center"/>
             <w:tcMar>
               <w:top w:w="40" w:type="dxa"/>
@@ -4857,7 +5438,7 @@
         </w:tc>
         <w:tc>
           <w:tcPr>
-            <w:tcW w:type="dxa" w:w="1296"/>
+            <w:tcW w:type="dxa" w:w="1152"/>
             <w:vAlign w:val="center"/>
             <w:tcMar>
               <w:top w:w="40" w:type="dxa"/>
@@ -4942,7 +5523,7 @@
         </w:tc>
         <w:tc>
           <w:tcPr>
-            <w:tcW w:type="dxa" w:w="2016"/>
+            <w:tcW w:type="dxa" w:w="2160"/>
             <w:vAlign w:val="center"/>
             <w:tcMar>
               <w:top w:w="40" w:type="dxa"/>
@@ -4970,7 +5551,7 @@
         </w:tc>
         <w:tc>
           <w:tcPr>
-            <w:tcW w:type="dxa" w:w="1296"/>
+            <w:tcW w:type="dxa" w:w="1152"/>
             <w:vAlign w:val="center"/>
             <w:tcMar>
               <w:top w:w="40" w:type="dxa"/>
@@ -5021,7 +5602,7 @@
                 <w:i w:val="0"/>
                 <w:sz w:val="16"/>
               </w:rPr>
-              <w:t>ANIO</w:t>
+              <w:t>ANIO / MES</w:t>
             </w:r>
           </w:p>
         </w:tc>
@@ -5054,7 +5635,7 @@
         </w:tc>
         <w:tc>
           <w:tcPr>
-            <w:tcW w:type="dxa" w:w="2016"/>
+            <w:tcW w:type="dxa" w:w="2160"/>
             <w:vAlign w:val="center"/>
             <w:tcMar>
               <w:top w:w="40" w:type="dxa"/>
@@ -5081,7 +5662,7 @@
         </w:tc>
         <w:tc>
           <w:tcPr>
-            <w:tcW w:type="dxa" w:w="1296"/>
+            <w:tcW w:type="dxa" w:w="1152"/>
             <w:vAlign w:val="center"/>
             <w:tcMar>
               <w:top w:w="40" w:type="dxa"/>
@@ -5132,7 +5713,7 @@
                 <w:i w:val="0"/>
                 <w:sz w:val="16"/>
               </w:rPr>
-              <w:t>MES</w:t>
+              <w:t>CANAL / SECTOR / OFICINA_VENTAS …</w:t>
             </w:r>
           </w:p>
         </w:tc>
@@ -5160,13 +5741,13 @@
                 <w:i w:val="0"/>
                 <w:sz w:val="16"/>
               </w:rPr>
-              <w:t>INTEGER</w:t>
-            </w:r>
-          </w:p>
-        </w:tc>
-        <w:tc>
-          <w:tcPr>
-            <w:tcW w:type="dxa" w:w="2016"/>
+              <w:t>NVARCHAR</w:t>
+            </w:r>
+          </w:p>
+        </w:tc>
+        <w:tc>
+          <w:tcPr>
+            <w:tcW w:type="dxa" w:w="2160"/>
             <w:vAlign w:val="center"/>
             <w:tcMar>
               <w:top w:w="40" w:type="dxa"/>
@@ -5188,13 +5769,13 @@
                 <w:i w:val="0"/>
                 <w:sz w:val="16"/>
               </w:rPr>
-              <w:t>Tiempo</w:t>
-            </w:r>
-          </w:p>
-        </w:tc>
-        <w:tc>
-          <w:tcPr>
-            <w:tcW w:type="dxa" w:w="1296"/>
+              <w:t>Dimensión</w:t>
+            </w:r>
+          </w:p>
+        </w:tc>
+        <w:tc>
+          <w:tcPr>
+            <w:tcW w:type="dxa" w:w="1152"/>
             <w:vAlign w:val="center"/>
             <w:tcMar>
               <w:top w:w="40" w:type="dxa"/>
@@ -5216,7 +5797,7 @@
                 <w:i w:val="0"/>
                 <w:sz w:val="16"/>
               </w:rPr>
-              <w:t>Sí</w:t>
+              <w:t>—</w:t>
             </w:r>
           </w:p>
         </w:tc>
@@ -5245,7 +5826,7 @@
                 <w:i w:val="0"/>
                 <w:sz w:val="16"/>
               </w:rPr>
-              <w:t>CANAL / SECTOR / OFICINA_VENTAS</w:t>
+              <w:t>CLIENTE / MATERIAL / VENDEDOR …</w:t>
             </w:r>
           </w:p>
         </w:tc>
@@ -5278,7 +5859,7 @@
         </w:tc>
         <w:tc>
           <w:tcPr>
-            <w:tcW w:type="dxa" w:w="2016"/>
+            <w:tcW w:type="dxa" w:w="2160"/>
             <w:vAlign w:val="center"/>
             <w:tcMar>
               <w:top w:w="40" w:type="dxa"/>
@@ -5305,7 +5886,7 @@
         </w:tc>
         <w:tc>
           <w:tcPr>
-            <w:tcW w:type="dxa" w:w="1296"/>
+            <w:tcW w:type="dxa" w:w="1152"/>
             <w:vAlign w:val="center"/>
             <w:tcMar>
               <w:top w:w="40" w:type="dxa"/>
@@ -5356,7 +5937,7 @@
                 <w:i w:val="0"/>
                 <w:sz w:val="16"/>
               </w:rPr>
-              <w:t>CENTRO_BENEFICIO / GRUPO_VENDEDORES / VENDEDOR</w:t>
+              <w:t>FAMILIA / LINEA / TIPO_INVENTARIO</w:t>
             </w:r>
           </w:p>
         </w:tc>
@@ -5390,7 +5971,7 @@
         </w:tc>
         <w:tc>
           <w:tcPr>
-            <w:tcW w:type="dxa" w:w="2016"/>
+            <w:tcW w:type="dxa" w:w="2160"/>
             <w:vAlign w:val="center"/>
             <w:tcMar>
               <w:top w:w="40" w:type="dxa"/>
@@ -5418,7 +5999,7 @@
         </w:tc>
         <w:tc>
           <w:tcPr>
-            <w:tcW w:type="dxa" w:w="1296"/>
+            <w:tcW w:type="dxa" w:w="1152"/>
             <w:vAlign w:val="center"/>
             <w:tcMar>
               <w:top w:w="40" w:type="dxa"/>
@@ -5469,7 +6050,7 @@
                 <w:i w:val="0"/>
                 <w:sz w:val="16"/>
               </w:rPr>
-              <w:t>CLIENTE / GRUPO_CLIENTES / SUCURSAL_CLIENTE</w:t>
+              <w:t>UNIDAD_MEDIDA</w:t>
             </w:r>
           </w:p>
         </w:tc>
@@ -5496,40 +6077,40 @@
                 <w:i w:val="0"/>
                 <w:sz w:val="16"/>
               </w:rPr>
-              <w:t>NVARCHAR</w:t>
-            </w:r>
-          </w:p>
-        </w:tc>
-        <w:tc>
-          <w:tcPr>
-            <w:tcW w:type="dxa" w:w="2016"/>
-            <w:vAlign w:val="center"/>
-            <w:tcMar>
-              <w:top w:w="40" w:type="dxa"/>
-              <w:bottom w:w="40" w:type="dxa"/>
-              <w:start w:w="80" w:type="dxa"/>
-              <w:end w:w="80" w:type="dxa"/>
-            </w:tcMar>
-          </w:tcPr>
-          <w:p>
-            <w:pPr>
-              <w:spacing w:after="20" w:before="20"/>
-              <w:jc w:val="left"/>
-            </w:pPr>
-            <w:r>
-              <w:rPr>
-                <w:rFonts w:ascii="Arial" w:hAnsi="Arial"/>
-                <w:b w:val="0"/>
-                <w:i w:val="0"/>
-                <w:sz w:val="16"/>
-              </w:rPr>
-              <w:t>Dimensión</w:t>
-            </w:r>
-          </w:p>
-        </w:tc>
-        <w:tc>
-          <w:tcPr>
-            <w:tcW w:type="dxa" w:w="1296"/>
+              <w:t>NVARCHAR(10)</w:t>
+            </w:r>
+          </w:p>
+        </w:tc>
+        <w:tc>
+          <w:tcPr>
+            <w:tcW w:type="dxa" w:w="2160"/>
+            <w:vAlign w:val="center"/>
+            <w:tcMar>
+              <w:top w:w="40" w:type="dxa"/>
+              <w:bottom w:w="40" w:type="dxa"/>
+              <w:start w:w="80" w:type="dxa"/>
+              <w:end w:w="80" w:type="dxa"/>
+            </w:tcMar>
+          </w:tcPr>
+          <w:p>
+            <w:pPr>
+              <w:spacing w:after="20" w:before="20"/>
+              <w:jc w:val="left"/>
+            </w:pPr>
+            <w:r>
+              <w:rPr>
+                <w:rFonts w:ascii="Arial" w:hAnsi="Arial"/>
+                <w:b w:val="0"/>
+                <w:i w:val="0"/>
+                <w:sz w:val="16"/>
+              </w:rPr>
+              <w:t>Atributo</w:t>
+            </w:r>
+          </w:p>
+        </w:tc>
+        <w:tc>
+          <w:tcPr>
+            <w:tcW w:type="dxa" w:w="1152"/>
             <w:vAlign w:val="center"/>
             <w:tcMar>
               <w:top w:w="40" w:type="dxa"/>
@@ -5580,7 +6161,7 @@
                 <w:i w:val="0"/>
                 <w:sz w:val="16"/>
               </w:rPr>
-              <w:t>MATERIAL / GRUPO_MATERIALES / JERARQUIA_MATERIALES</w:t>
+              <w:t>CANTIDAD / VALOR</w:t>
             </w:r>
           </w:p>
         </w:tc>
@@ -5608,13 +6189,13 @@
                 <w:i w:val="0"/>
                 <w:sz w:val="16"/>
               </w:rPr>
-              <w:t>NVARCHAR</w:t>
-            </w:r>
-          </w:p>
-        </w:tc>
-        <w:tc>
-          <w:tcPr>
-            <w:tcW w:type="dxa" w:w="2016"/>
+              <w:t>DECIMAL</w:t>
+            </w:r>
+          </w:p>
+        </w:tc>
+        <w:tc>
+          <w:tcPr>
+            <w:tcW w:type="dxa" w:w="2160"/>
             <w:vAlign w:val="center"/>
             <w:tcMar>
               <w:top w:w="40" w:type="dxa"/>
@@ -5636,13 +6217,13 @@
                 <w:i w:val="0"/>
                 <w:sz w:val="16"/>
               </w:rPr>
-              <w:t>Dimensión</w:t>
-            </w:r>
-          </w:p>
-        </w:tc>
-        <w:tc>
-          <w:tcPr>
-            <w:tcW w:type="dxa" w:w="1296"/>
+              <w:t>Medida</w:t>
+            </w:r>
+          </w:p>
+        </w:tc>
+        <w:tc>
+          <w:tcPr>
+            <w:tcW w:type="dxa" w:w="1152"/>
             <w:vAlign w:val="center"/>
             <w:tcMar>
               <w:top w:w="40" w:type="dxa"/>
@@ -5693,7 +6274,7 @@
                 <w:i w:val="0"/>
                 <w:sz w:val="16"/>
               </w:rPr>
-              <w:t>FAMILIA / LINEA / TIPO_INVENTARIO</w:t>
+              <w:t>VERSION</w:t>
             </w:r>
           </w:p>
         </w:tc>
@@ -5720,40 +6301,40 @@
                 <w:i w:val="0"/>
                 <w:sz w:val="16"/>
               </w:rPr>
-              <w:t>NVARCHAR</w:t>
-            </w:r>
-          </w:p>
-        </w:tc>
-        <w:tc>
-          <w:tcPr>
-            <w:tcW w:type="dxa" w:w="2016"/>
-            <w:vAlign w:val="center"/>
-            <w:tcMar>
-              <w:top w:w="40" w:type="dxa"/>
-              <w:bottom w:w="40" w:type="dxa"/>
-              <w:start w:w="80" w:type="dxa"/>
-              <w:end w:w="80" w:type="dxa"/>
-            </w:tcMar>
-          </w:tcPr>
-          <w:p>
-            <w:pPr>
-              <w:spacing w:after="20" w:before="20"/>
-              <w:jc w:val="left"/>
-            </w:pPr>
-            <w:r>
-              <w:rPr>
-                <w:rFonts w:ascii="Arial" w:hAnsi="Arial"/>
-                <w:b w:val="0"/>
-                <w:i w:val="0"/>
-                <w:sz w:val="16"/>
-              </w:rPr>
-              <w:t>Dimensión</w:t>
-            </w:r>
-          </w:p>
-        </w:tc>
-        <w:tc>
-          <w:tcPr>
-            <w:tcW w:type="dxa" w:w="1296"/>
+              <w:t>NVARCHAR(20)</w:t>
+            </w:r>
+          </w:p>
+        </w:tc>
+        <w:tc>
+          <w:tcPr>
+            <w:tcW w:type="dxa" w:w="2160"/>
+            <w:vAlign w:val="center"/>
+            <w:tcMar>
+              <w:top w:w="40" w:type="dxa"/>
+              <w:bottom w:w="40" w:type="dxa"/>
+              <w:start w:w="80" w:type="dxa"/>
+              <w:end w:w="80" w:type="dxa"/>
+            </w:tcMar>
+          </w:tcPr>
+          <w:p>
+            <w:pPr>
+              <w:spacing w:after="20" w:before="20"/>
+              <w:jc w:val="left"/>
+            </w:pPr>
+            <w:r>
+              <w:rPr>
+                <w:rFonts w:ascii="Arial" w:hAnsi="Arial"/>
+                <w:b w:val="0"/>
+                <w:i w:val="0"/>
+                <w:sz w:val="16"/>
+              </w:rPr>
+              <w:t>Control = «Presupuesto»</w:t>
+            </w:r>
+          </w:p>
+        </w:tc>
+        <w:tc>
+          <w:tcPr>
+            <w:tcW w:type="dxa" w:w="1152"/>
             <w:vAlign w:val="center"/>
             <w:tcMar>
               <w:top w:w="40" w:type="dxa"/>
@@ -5804,7 +6385,7 @@
                 <w:i w:val="0"/>
                 <w:sz w:val="16"/>
               </w:rPr>
-              <w:t>UNIDAD_MEDIDA</w:t>
+              <w:t>FECHA_CARGA / ORIGEN</w:t>
             </w:r>
           </w:p>
         </w:tc>
@@ -5832,13 +6413,13 @@
                 <w:i w:val="0"/>
                 <w:sz w:val="16"/>
               </w:rPr>
-              <w:t>NVARCHAR(10)</w:t>
-            </w:r>
-          </w:p>
-        </w:tc>
-        <w:tc>
-          <w:tcPr>
-            <w:tcW w:type="dxa" w:w="2016"/>
+              <w:t>TIMESTAMP / NVARCHAR</w:t>
+            </w:r>
+          </w:p>
+        </w:tc>
+        <w:tc>
+          <w:tcPr>
+            <w:tcW w:type="dxa" w:w="2160"/>
             <w:vAlign w:val="center"/>
             <w:tcMar>
               <w:top w:w="40" w:type="dxa"/>
@@ -5860,461 +6441,13 @@
                 <w:i w:val="0"/>
                 <w:sz w:val="16"/>
               </w:rPr>
-              <w:t>Atributo</w:t>
-            </w:r>
-          </w:p>
-        </w:tc>
-        <w:tc>
-          <w:tcPr>
-            <w:tcW w:type="dxa" w:w="1296"/>
-            <w:vAlign w:val="center"/>
-            <w:tcMar>
-              <w:top w:w="40" w:type="dxa"/>
-              <w:bottom w:w="40" w:type="dxa"/>
-              <w:start w:w="80" w:type="dxa"/>
-              <w:end w:w="80" w:type="dxa"/>
-            </w:tcMar>
-            <w:shd w:val="clear" w:color="auto" w:fill="F2F6FC"/>
-          </w:tcPr>
-          <w:p>
-            <w:pPr>
-              <w:spacing w:after="20" w:before="20"/>
-              <w:jc w:val="left"/>
-            </w:pPr>
-            <w:r>
-              <w:rPr>
-                <w:rFonts w:ascii="Arial" w:hAnsi="Arial"/>
-                <w:b w:val="0"/>
-                <w:i w:val="0"/>
-                <w:sz w:val="16"/>
-              </w:rPr>
-              <w:t>—</w:t>
-            </w:r>
-          </w:p>
-        </w:tc>
-      </w:tr>
-      <w:tr>
-        <w:tc>
-          <w:tcPr>
-            <w:tcW w:type="dxa" w:w="4176"/>
-            <w:vAlign w:val="center"/>
-            <w:tcMar>
-              <w:top w:w="40" w:type="dxa"/>
-              <w:bottom w:w="40" w:type="dxa"/>
-              <w:start w:w="80" w:type="dxa"/>
-              <w:end w:w="80" w:type="dxa"/>
-            </w:tcMar>
-          </w:tcPr>
-          <w:p>
-            <w:pPr>
-              <w:spacing w:after="20" w:before="20"/>
-              <w:jc w:val="left"/>
-            </w:pPr>
-            <w:r>
-              <w:rPr>
-                <w:rFonts w:ascii="Arial" w:hAnsi="Arial"/>
-                <w:b w:val="0"/>
-                <w:i w:val="0"/>
-                <w:sz w:val="16"/>
-              </w:rPr>
-              <w:t>CANTIDAD</w:t>
-            </w:r>
-          </w:p>
-        </w:tc>
-        <w:tc>
-          <w:tcPr>
-            <w:tcW w:type="dxa" w:w="2016"/>
-            <w:vAlign w:val="center"/>
-            <w:tcMar>
-              <w:top w:w="40" w:type="dxa"/>
-              <w:bottom w:w="40" w:type="dxa"/>
-              <w:start w:w="80" w:type="dxa"/>
-              <w:end w:w="80" w:type="dxa"/>
-            </w:tcMar>
-          </w:tcPr>
-          <w:p>
-            <w:pPr>
-              <w:spacing w:after="20" w:before="20"/>
-              <w:jc w:val="left"/>
-            </w:pPr>
-            <w:r>
-              <w:rPr>
-                <w:rFonts w:ascii="Arial" w:hAnsi="Arial"/>
-                <w:b w:val="0"/>
-                <w:i w:val="0"/>
-                <w:sz w:val="16"/>
-              </w:rPr>
-              <w:t>DECIMAL(23,3)</w:t>
-            </w:r>
-          </w:p>
-        </w:tc>
-        <w:tc>
-          <w:tcPr>
-            <w:tcW w:type="dxa" w:w="2016"/>
-            <w:vAlign w:val="center"/>
-            <w:tcMar>
-              <w:top w:w="40" w:type="dxa"/>
-              <w:bottom w:w="40" w:type="dxa"/>
-              <w:start w:w="80" w:type="dxa"/>
-              <w:end w:w="80" w:type="dxa"/>
-            </w:tcMar>
-          </w:tcPr>
-          <w:p>
-            <w:pPr>
-              <w:spacing w:after="20" w:before="20"/>
-              <w:jc w:val="left"/>
-            </w:pPr>
-            <w:r>
-              <w:rPr>
-                <w:rFonts w:ascii="Arial" w:hAnsi="Arial"/>
-                <w:b w:val="0"/>
-                <w:i w:val="0"/>
-                <w:sz w:val="16"/>
-              </w:rPr>
-              <w:t>Medida</w:t>
-            </w:r>
-          </w:p>
-        </w:tc>
-        <w:tc>
-          <w:tcPr>
-            <w:tcW w:type="dxa" w:w="1296"/>
-            <w:vAlign w:val="center"/>
-            <w:tcMar>
-              <w:top w:w="40" w:type="dxa"/>
-              <w:bottom w:w="40" w:type="dxa"/>
-              <w:start w:w="80" w:type="dxa"/>
-              <w:end w:w="80" w:type="dxa"/>
-            </w:tcMar>
-          </w:tcPr>
-          <w:p>
-            <w:pPr>
-              <w:spacing w:after="20" w:before="20"/>
-              <w:jc w:val="left"/>
-            </w:pPr>
-            <w:r>
-              <w:rPr>
-                <w:rFonts w:ascii="Arial" w:hAnsi="Arial"/>
-                <w:b w:val="0"/>
-                <w:i w:val="0"/>
-                <w:sz w:val="16"/>
-              </w:rPr>
-              <w:t>—</w:t>
-            </w:r>
-          </w:p>
-        </w:tc>
-      </w:tr>
-      <w:tr>
-        <w:tc>
-          <w:tcPr>
-            <w:tcW w:type="dxa" w:w="4176"/>
-            <w:vAlign w:val="center"/>
-            <w:tcMar>
-              <w:top w:w="40" w:type="dxa"/>
-              <w:bottom w:w="40" w:type="dxa"/>
-              <w:start w:w="80" w:type="dxa"/>
-              <w:end w:w="80" w:type="dxa"/>
-            </w:tcMar>
-            <w:shd w:val="clear" w:color="auto" w:fill="F2F6FC"/>
-          </w:tcPr>
-          <w:p>
-            <w:pPr>
-              <w:spacing w:after="20" w:before="20"/>
-              <w:jc w:val="left"/>
-            </w:pPr>
-            <w:r>
-              <w:rPr>
-                <w:rFonts w:ascii="Arial" w:hAnsi="Arial"/>
-                <w:b w:val="0"/>
-                <w:i w:val="0"/>
-                <w:sz w:val="16"/>
-              </w:rPr>
-              <w:t>VALOR</w:t>
-            </w:r>
-          </w:p>
-        </w:tc>
-        <w:tc>
-          <w:tcPr>
-            <w:tcW w:type="dxa" w:w="2016"/>
-            <w:vAlign w:val="center"/>
-            <w:tcMar>
-              <w:top w:w="40" w:type="dxa"/>
-              <w:bottom w:w="40" w:type="dxa"/>
-              <w:start w:w="80" w:type="dxa"/>
-              <w:end w:w="80" w:type="dxa"/>
-            </w:tcMar>
-            <w:shd w:val="clear" w:color="auto" w:fill="F2F6FC"/>
-          </w:tcPr>
-          <w:p>
-            <w:pPr>
-              <w:spacing w:after="20" w:before="20"/>
-              <w:jc w:val="left"/>
-            </w:pPr>
-            <w:r>
-              <w:rPr>
-                <w:rFonts w:ascii="Arial" w:hAnsi="Arial"/>
-                <w:b w:val="0"/>
-                <w:i w:val="0"/>
-                <w:sz w:val="16"/>
-              </w:rPr>
-              <w:t>DECIMAL(23,2)</w:t>
-            </w:r>
-          </w:p>
-        </w:tc>
-        <w:tc>
-          <w:tcPr>
-            <w:tcW w:type="dxa" w:w="2016"/>
-            <w:vAlign w:val="center"/>
-            <w:tcMar>
-              <w:top w:w="40" w:type="dxa"/>
-              <w:bottom w:w="40" w:type="dxa"/>
-              <w:start w:w="80" w:type="dxa"/>
-              <w:end w:w="80" w:type="dxa"/>
-            </w:tcMar>
-            <w:shd w:val="clear" w:color="auto" w:fill="F2F6FC"/>
-          </w:tcPr>
-          <w:p>
-            <w:pPr>
-              <w:spacing w:after="20" w:before="20"/>
-              <w:jc w:val="left"/>
-            </w:pPr>
-            <w:r>
-              <w:rPr>
-                <w:rFonts w:ascii="Arial" w:hAnsi="Arial"/>
-                <w:b w:val="0"/>
-                <w:i w:val="0"/>
-                <w:sz w:val="16"/>
-              </w:rPr>
-              <w:t>Medida</w:t>
-            </w:r>
-          </w:p>
-        </w:tc>
-        <w:tc>
-          <w:tcPr>
-            <w:tcW w:type="dxa" w:w="1296"/>
-            <w:vAlign w:val="center"/>
-            <w:tcMar>
-              <w:top w:w="40" w:type="dxa"/>
-              <w:bottom w:w="40" w:type="dxa"/>
-              <w:start w:w="80" w:type="dxa"/>
-              <w:end w:w="80" w:type="dxa"/>
-            </w:tcMar>
-            <w:shd w:val="clear" w:color="auto" w:fill="F2F6FC"/>
-          </w:tcPr>
-          <w:p>
-            <w:pPr>
-              <w:spacing w:after="20" w:before="20"/>
-              <w:jc w:val="left"/>
-            </w:pPr>
-            <w:r>
-              <w:rPr>
-                <w:rFonts w:ascii="Arial" w:hAnsi="Arial"/>
-                <w:b w:val="0"/>
-                <w:i w:val="0"/>
-                <w:sz w:val="16"/>
-              </w:rPr>
-              <w:t>—</w:t>
-            </w:r>
-          </w:p>
-        </w:tc>
-      </w:tr>
-      <w:tr>
-        <w:tc>
-          <w:tcPr>
-            <w:tcW w:type="dxa" w:w="4176"/>
-            <w:vAlign w:val="center"/>
-            <w:tcMar>
-              <w:top w:w="40" w:type="dxa"/>
-              <w:bottom w:w="40" w:type="dxa"/>
-              <w:start w:w="80" w:type="dxa"/>
-              <w:end w:w="80" w:type="dxa"/>
-            </w:tcMar>
-          </w:tcPr>
-          <w:p>
-            <w:pPr>
-              <w:spacing w:after="20" w:before="20"/>
-              <w:jc w:val="left"/>
-            </w:pPr>
-            <w:r>
-              <w:rPr>
-                <w:rFonts w:ascii="Arial" w:hAnsi="Arial"/>
-                <w:b w:val="0"/>
-                <w:i w:val="0"/>
-                <w:sz w:val="16"/>
-              </w:rPr>
-              <w:t>VERSION</w:t>
-            </w:r>
-          </w:p>
-        </w:tc>
-        <w:tc>
-          <w:tcPr>
-            <w:tcW w:type="dxa" w:w="2016"/>
-            <w:vAlign w:val="center"/>
-            <w:tcMar>
-              <w:top w:w="40" w:type="dxa"/>
-              <w:bottom w:w="40" w:type="dxa"/>
-              <w:start w:w="80" w:type="dxa"/>
-              <w:end w:w="80" w:type="dxa"/>
-            </w:tcMar>
-          </w:tcPr>
-          <w:p>
-            <w:pPr>
-              <w:spacing w:after="20" w:before="20"/>
-              <w:jc w:val="left"/>
-            </w:pPr>
-            <w:r>
-              <w:rPr>
-                <w:rFonts w:ascii="Arial" w:hAnsi="Arial"/>
-                <w:b w:val="0"/>
-                <w:i w:val="0"/>
-                <w:sz w:val="16"/>
-              </w:rPr>
-              <w:t>NVARCHAR(20)</w:t>
-            </w:r>
-          </w:p>
-        </w:tc>
-        <w:tc>
-          <w:tcPr>
-            <w:tcW w:type="dxa" w:w="2016"/>
-            <w:vAlign w:val="center"/>
-            <w:tcMar>
-              <w:top w:w="40" w:type="dxa"/>
-              <w:bottom w:w="40" w:type="dxa"/>
-              <w:start w:w="80" w:type="dxa"/>
-              <w:end w:w="80" w:type="dxa"/>
-            </w:tcMar>
-          </w:tcPr>
-          <w:p>
-            <w:pPr>
-              <w:spacing w:after="20" w:before="20"/>
-              <w:jc w:val="left"/>
-            </w:pPr>
-            <w:r>
-              <w:rPr>
-                <w:rFonts w:ascii="Arial" w:hAnsi="Arial"/>
-                <w:b w:val="0"/>
-                <w:i w:val="0"/>
-                <w:sz w:val="16"/>
-              </w:rPr>
-              <w:t>Control (p. ej. «Comercial»)</w:t>
-            </w:r>
-          </w:p>
-        </w:tc>
-        <w:tc>
-          <w:tcPr>
-            <w:tcW w:type="dxa" w:w="1296"/>
-            <w:vAlign w:val="center"/>
-            <w:tcMar>
-              <w:top w:w="40" w:type="dxa"/>
-              <w:bottom w:w="40" w:type="dxa"/>
-              <w:start w:w="80" w:type="dxa"/>
-              <w:end w:w="80" w:type="dxa"/>
-            </w:tcMar>
-          </w:tcPr>
-          <w:p>
-            <w:pPr>
-              <w:spacing w:after="20" w:before="20"/>
-              <w:jc w:val="left"/>
-            </w:pPr>
-            <w:r>
-              <w:rPr>
-                <w:rFonts w:ascii="Arial" w:hAnsi="Arial"/>
-                <w:b w:val="0"/>
-                <w:i w:val="0"/>
-                <w:sz w:val="16"/>
-              </w:rPr>
-              <w:t>—</w:t>
-            </w:r>
-          </w:p>
-        </w:tc>
-      </w:tr>
-      <w:tr>
-        <w:tc>
-          <w:tcPr>
-            <w:tcW w:type="dxa" w:w="4176"/>
-            <w:vAlign w:val="center"/>
-            <w:tcMar>
-              <w:top w:w="40" w:type="dxa"/>
-              <w:bottom w:w="40" w:type="dxa"/>
-              <w:start w:w="80" w:type="dxa"/>
-              <w:end w:w="80" w:type="dxa"/>
-            </w:tcMar>
-            <w:shd w:val="clear" w:color="auto" w:fill="F2F6FC"/>
-          </w:tcPr>
-          <w:p>
-            <w:pPr>
-              <w:spacing w:after="20" w:before="20"/>
-              <w:jc w:val="left"/>
-            </w:pPr>
-            <w:r>
-              <w:rPr>
-                <w:rFonts w:ascii="Arial" w:hAnsi="Arial"/>
-                <w:b w:val="0"/>
-                <w:i w:val="0"/>
-                <w:sz w:val="16"/>
-              </w:rPr>
-              <w:t>FECHA_CARGA / ORIGEN</w:t>
-            </w:r>
-          </w:p>
-        </w:tc>
-        <w:tc>
-          <w:tcPr>
-            <w:tcW w:type="dxa" w:w="2016"/>
-            <w:vAlign w:val="center"/>
-            <w:tcMar>
-              <w:top w:w="40" w:type="dxa"/>
-              <w:bottom w:w="40" w:type="dxa"/>
-              <w:start w:w="80" w:type="dxa"/>
-              <w:end w:w="80" w:type="dxa"/>
-            </w:tcMar>
-            <w:shd w:val="clear" w:color="auto" w:fill="F2F6FC"/>
-          </w:tcPr>
-          <w:p>
-            <w:pPr>
-              <w:spacing w:after="20" w:before="20"/>
-              <w:jc w:val="left"/>
-            </w:pPr>
-            <w:r>
-              <w:rPr>
-                <w:rFonts w:ascii="Arial" w:hAnsi="Arial"/>
-                <w:b w:val="0"/>
-                <w:i w:val="0"/>
-                <w:sz w:val="16"/>
-              </w:rPr>
-              <w:t>TIMESTAMP / NVARCHAR</w:t>
-            </w:r>
-          </w:p>
-        </w:tc>
-        <w:tc>
-          <w:tcPr>
-            <w:tcW w:type="dxa" w:w="2016"/>
-            <w:vAlign w:val="center"/>
-            <w:tcMar>
-              <w:top w:w="40" w:type="dxa"/>
-              <w:bottom w:w="40" w:type="dxa"/>
-              <w:start w:w="80" w:type="dxa"/>
-              <w:end w:w="80" w:type="dxa"/>
-            </w:tcMar>
-            <w:shd w:val="clear" w:color="auto" w:fill="F2F6FC"/>
-          </w:tcPr>
-          <w:p>
-            <w:pPr>
-              <w:spacing w:after="20" w:before="20"/>
-              <w:jc w:val="left"/>
-            </w:pPr>
-            <w:r>
-              <w:rPr>
-                <w:rFonts w:ascii="Arial" w:hAnsi="Arial"/>
-                <w:b w:val="0"/>
-                <w:i w:val="0"/>
-                <w:sz w:val="16"/>
-              </w:rPr>
-              <w:t>Control / auditoría</w:t>
-            </w:r>
-          </w:p>
-        </w:tc>
-        <w:tc>
-          <w:tcPr>
-            <w:tcW w:type="dxa" w:w="1296"/>
+              <w:t>Auditoría</w:t>
+            </w:r>
+          </w:p>
+        </w:tc>
+        <w:tc>
+          <w:tcPr>
+            <w:tcW w:type="dxa" w:w="1152"/>
             <w:vAlign w:val="center"/>
             <w:tcMar>
               <w:top w:w="40" w:type="dxa"/>
@@ -6346,6 +6479,31 @@
       <w:pPr>
         <w:spacing w:after="80" w:before="0"/>
       </w:pPr>
+    </w:p>
+    <w:p>
+      <w:pPr>
+        <w:pStyle w:val="Heading2"/>
+        <w:keepNext/>
+        <w:spacing w:before="200" w:after="80"/>
+      </w:pPr>
+      <w:r>
+        <w:t>Tabla de Real (desde S/4HANA) y vista Real vs. Presupuesto</w:t>
+      </w:r>
+    </w:p>
+    <w:p>
+      <w:pPr>
+        <w:spacing w:after="120"/>
+        <w:jc w:val="both"/>
+      </w:pPr>
+      <w:r>
+        <w:rPr>
+          <w:rFonts w:ascii="Arial" w:hAnsi="Arial"/>
+          <w:b w:val="0"/>
+          <w:i w:val="0"/>
+          <w:sz w:val="19"/>
+        </w:rPr>
+        <w:t>La Tabla Real replica del real las mismas dimensiones comunes y las medidas Cantidad y Valor (VERSION = «Real»). La vista «Real vs. Presupuesto» combina ambas tablas por sociedad, periodo y dimensiones comunes, y expone las medidas Real, Presupuesto y su Variación ($ y %).</w:t>
+      </w:r>
     </w:p>
     <w:tbl>
       <w:tblPr>
@@ -6393,7 +6551,7 @@
                 <w:color w:val="FFFFFF"/>
                 <w:sz w:val="18"/>
               </w:rPr>
-              <w:t>●  Granularidad y clave</w:t>
+              <w:t>●  Vista Real vs. Presupuesto</w:t>
             </w:r>
           </w:p>
         </w:tc>
@@ -6420,7 +6578,31 @@
                 <w:rFonts w:ascii="Arial" w:hAnsi="Arial"/>
                 <w:sz w:val="17"/>
               </w:rPr>
-              <w:t>El grano del registro es la combinación de todas las dimensiones informadas más Año y Mes. Se recomienda una clave técnica (ID) o la combinación Sociedad + Organización + Año + Mes + dimensiones para evitar duplicados en las recargas.</w:t>
+              <w:t>▸  Entrada: Tabla Presupuesto (VERSION=Presupuesto) + Tabla Real (VERSION=Real).</w:t>
+            </w:r>
+          </w:p>
+          <w:p>
+            <w:pPr>
+              <w:spacing w:after="40" w:before="0"/>
+            </w:pPr>
+            <w:r>
+              <w:rPr>
+                <w:rFonts w:ascii="Arial" w:hAnsi="Arial"/>
+                <w:sz w:val="17"/>
+              </w:rPr>
+              <w:t>▸  Combinación por: Sociedad, Año, Mes y las dimensiones comunes armonizadas.</w:t>
+            </w:r>
+          </w:p>
+          <w:p>
+            <w:pPr>
+              <w:spacing w:after="40" w:before="0"/>
+            </w:pPr>
+            <w:r>
+              <w:rPr>
+                <w:rFonts w:ascii="Arial" w:hAnsi="Arial"/>
+                <w:sz w:val="17"/>
+              </w:rPr>
+              <w:t>▸  Salida: medidas Real, Presupuesto, Variación ($) = Real − Presupuesto, y Variación (%).</w:t>
             </w:r>
           </w:p>
         </w:tc>
@@ -6438,7 +6620,7 @@
         <w:spacing w:before="280" w:after="120"/>
       </w:pPr>
       <w:r>
-        <w:t>Opciones de carga a SAP Datasphere</w:t>
+        <w:t>Opciones de carga del archivo a SAP Datasphere</w:t>
       </w:r>
     </w:p>
     <w:p>
@@ -6453,7 +6635,7 @@
           <w:i w:val="0"/>
           <w:sz w:val="20"/>
         </w:rPr>
-        <w:t>A continuación se presentan cuatro propuestas para llevar el archivo directamente a SAP Datasphere. Todas desembocan en una tabla y una vista dentro del Space, listas para el consumo en SAC. La figura siguiente resume las opciones.</w:t>
+        <w:t>Se presentan cuatro opciones para llevar el archivo del presupuesto a Datasphere. Todas desembocan en la Tabla Presupuesto del Space, que luego se combina con la Tabla Real. La figura resume las opciones; la sección siguiente detalla la opción recomendada.</w:t>
       </w:r>
     </w:p>
     <w:p>
@@ -6465,7 +6647,7 @@
         <w:drawing>
           <wp:inline>
             <wp:extent cx="6035040" cy="3055432"/>
-            <wp:docPr id="3" name="Picture 3"/>
+            <wp:docPr id="4" name="Picture 4"/>
             <wp:cNvGraphicFramePr>
               <a:graphicFrameLocks noChangeAspect="1"/>
             </wp:cNvGraphicFramePr>
@@ -6477,7 +6659,7 @@
                     <pic:cNvPicPr/>
                   </pic:nvPicPr>
                   <pic:blipFill>
-                    <a:blip r:embed="rId27"/>
+                    <a:blip r:embed="rId28"/>
                     <a:stretch>
                       <a:fillRect/>
                     </a:stretch>
@@ -6508,7 +6690,7 @@
           <w:color w:val="595959"/>
           <w:sz w:val="17"/>
         </w:rPr>
-        <w:t>Figura 1. Opciones de arquitectura para cargar el presupuesto comercial a SAP Datasphere.</w:t>
+        <w:t>Figura 2. Opciones de carga del archivo del presupuesto (todas desembocan en Datasphere → Power BI/SAC).</w:t>
       </w:r>
     </w:p>
     <w:p>
@@ -6545,7 +6727,7 @@
         <w:drawing>
           <wp:inline>
             <wp:extent cx="6035040" cy="2448839"/>
-            <wp:docPr id="4" name="Picture 4"/>
+            <wp:docPr id="5" name="Picture 5"/>
             <wp:cNvGraphicFramePr>
               <a:graphicFrameLocks noChangeAspect="1"/>
             </wp:cNvGraphicFramePr>
@@ -6557,7 +6739,7 @@
                     <pic:cNvPicPr/>
                   </pic:nvPicPr>
                   <pic:blipFill>
-                    <a:blip r:embed="rId28"/>
+                    <a:blip r:embed="rId29"/>
                     <a:stretch>
                       <a:fillRect/>
                     </a:stretch>
@@ -6588,7 +6770,7 @@
           <w:color w:val="595959"/>
           <w:sz w:val="17"/>
         </w:rPr>
-        <w:t>Figura 2. Propuesta 1 — Carga manual mediante importación de CSV.</w:t>
+        <w:t>Figura 3. Propuesta 1 — Carga manual mediante importación de CSV.</w:t>
       </w:r>
     </w:p>
     <w:p>
@@ -6630,7 +6812,7 @@
           <w:rFonts w:ascii="Arial" w:hAnsi="Arial"/>
           <w:sz w:val="20"/>
         </w:rPr>
-        <w:t>▪  Crear la vista analítica (definir medidas y atributos) y exponerla para consumo.</w:t>
+        <w:t>▪  Crear la vista analítica y combinarla con la Tabla Real.</w:t>
       </w:r>
     </w:p>
     <w:tbl>
@@ -6706,7 +6888,7 @@
                 <w:rFonts w:ascii="Arial" w:hAnsi="Arial"/>
                 <w:sz w:val="17"/>
               </w:rPr>
-              <w:t>Cargas puntuales, piloto o primera carga; volumen bajo; sin necesidad de automatización. Ventaja: rápida, sin infraestructura. Limitación: manual, no automatizable, requiere convertir Excel→CSV.</w:t>
+              <w:t>Cargas puntuales, piloto o primera carga; volumen bajo; sin automatización. Ventaja: rápida, sin infraestructura. Limitación: manual, no automatizable, requiere Excel→CSV.</w:t>
             </w:r>
           </w:p>
         </w:tc>
@@ -6724,7 +6906,7 @@
         <w:spacing w:before="200" w:after="80"/>
       </w:pPr>
       <w:r>
-        <w:t>Propuesta 2 — Almacenamiento en la nube + Replication Flow (recomendada)</w:t>
+        <w:t>Propuesta 2 — Almacenamiento en la nube + Replication/Data Flow</w:t>
       </w:r>
     </w:p>
     <w:p>
@@ -6739,7 +6921,7 @@
           <w:i w:val="0"/>
           <w:sz w:val="20"/>
         </w:rPr>
-        <w:t>El archivo (convertido a CSV o Parquet) se deposita en un almacenamiento de objetos en la nube (Amazon S3, Azure Blob, Google Cloud Storage o SFTP). En Datasphere se crea una conexión a ese almacenamiento y un Replication Flow (o Data Flow) programado que ingiere el/los archivo(s) a la tabla local.</w:t>
+        <w:t>El archivo (CSV/Parquet) se deposita en un almacenamiento de objetos en la nube (Amazon S3, Azure Blob, Google Cloud Storage o SFTP). En Datasphere se crea una conexión a ese almacenamiento y un Replication/Data Flow programado que ingiere el/los archivo(s) a la Tabla Presupuesto.</w:t>
       </w:r>
     </w:p>
     <w:p>
@@ -6751,7 +6933,7 @@
         <w:drawing>
           <wp:inline>
             <wp:extent cx="6035040" cy="2448839"/>
-            <wp:docPr id="5" name="Picture 5"/>
+            <wp:docPr id="6" name="Picture 6"/>
             <wp:cNvGraphicFramePr>
               <a:graphicFrameLocks noChangeAspect="1"/>
             </wp:cNvGraphicFramePr>
@@ -6763,7 +6945,7 @@
                     <pic:cNvPicPr/>
                   </pic:nvPicPr>
                   <pic:blipFill>
-                    <a:blip r:embed="rId29"/>
+                    <a:blip r:embed="rId30"/>
                     <a:stretch>
                       <a:fillRect/>
                     </a:stretch>
@@ -6794,7 +6976,7 @@
           <w:color w:val="595959"/>
           <w:sz w:val="17"/>
         </w:rPr>
-        <w:t>Figura 3. Propuesta 2 — Almacenamiento en la nube + Replication Flow (recomendada).</w:t>
+        <w:t>Figura 4. Propuesta 2 — Almacenamiento en la nube + Replication/Data Flow.</w:t>
       </w:r>
     </w:p>
     <w:p>
@@ -6836,21 +7018,7 @@
           <w:rFonts w:ascii="Arial" w:hAnsi="Arial"/>
           <w:sz w:val="20"/>
         </w:rPr>
-        <w:t>▪  Construir el Replication/Data Flow y programarlo (carga por periodo, append/upsert).</w:t>
-      </w:r>
-    </w:p>
-    <w:p>
-      <w:pPr>
-        <w:pStyle w:val="ListParagraph"/>
-        <w:spacing w:after="40"/>
-        <w:ind w:left="432"/>
-      </w:pPr>
-      <w:r>
-        <w:rPr>
-          <w:rFonts w:ascii="Arial" w:hAnsi="Arial"/>
-          <w:sz w:val="20"/>
-        </w:rPr>
-        <w:t>▪  Publicar la tabla y la vista analítica para consumo.</w:t>
+        <w:t>▪  Construir el flujo y programarlo (carga por periodo, append/upsert).</w:t>
       </w:r>
     </w:p>
     <w:tbl>
@@ -6926,7 +7094,7 @@
                 <w:rFonts w:ascii="Arial" w:hAnsi="Arial"/>
                 <w:sz w:val="17"/>
               </w:rPr>
-              <w:t>Carga recurrente (mensual/anual) y productiva. Ventaja: automatizable, programada, mayor volumen y trazabilidad; separa la responsabilidad (el negocio deposita el archivo, Datasphere lo ingiere). Requiere: servicio de almacenamiento y su configuración.</w:t>
+              <w:t>Carga recurrente y productiva. Es la base de la propuesta recomendada (ver sección siguiente).</w:t>
             </w:r>
           </w:p>
         </w:tc>
@@ -6959,7 +7127,7 @@
           <w:i w:val="0"/>
           <w:sz w:val="20"/>
         </w:rPr>
-        <w:t>Se habilita un Open SQL Schema (usuario de base de datos) en el Space. Un script de Python lee el Excel con pandas, valida y normaliza (incluida la lógica de la matriz de aplicabilidad y el pivoteo de meses), y carga los datos con hdbcli / hana_ml (o JDBC/ODBC) en una tabla que se expone al Space.</w:t>
+        <w:t>Se habilita un Open SQL Schema (usuario de base de datos) en el Space. Un script de Python lee el Excel con pandas, valida y normaliza (aplicabilidad y pivoteo de meses) y carga con hdbcli / hana_ml (o JDBC/ODBC) en una tabla que se expone al Space.</w:t>
       </w:r>
     </w:p>
     <w:p>
@@ -6971,7 +7139,7 @@
         <w:drawing>
           <wp:inline>
             <wp:extent cx="6035040" cy="2448839"/>
-            <wp:docPr id="6" name="Picture 6"/>
+            <wp:docPr id="7" name="Picture 7"/>
             <wp:cNvGraphicFramePr>
               <a:graphicFrameLocks noChangeAspect="1"/>
             </wp:cNvGraphicFramePr>
@@ -6983,7 +7151,7 @@
                     <pic:cNvPicPr/>
                   </pic:nvPicPr>
                   <pic:blipFill>
-                    <a:blip r:embed="rId30"/>
+                    <a:blip r:embed="rId31"/>
                     <a:stretch>
                       <a:fillRect/>
                     </a:stretch>
@@ -7014,7 +7182,7 @@
           <w:color w:val="595959"/>
           <w:sz w:val="17"/>
         </w:rPr>
-        <w:t>Figura 4. Propuesta 3 — Open SQL Schema con carga programática en Python.</w:t>
+        <w:t>Figura 5. Propuesta 3 — Open SQL Schema con carga programática en Python.</w:t>
       </w:r>
     </w:p>
     <w:p>
@@ -7028,7 +7196,7 @@
           <w:rFonts w:ascii="Arial" w:hAnsi="Arial"/>
           <w:sz w:val="20"/>
         </w:rPr>
-        <w:t>▪  Crear el usuario/esquema Open SQL y otorgar los permisos mínimos necesarios.</w:t>
+        <w:t>▪  Crear el usuario/esquema Open SQL con permisos mínimos.</w:t>
       </w:r>
     </w:p>
     <w:p>
@@ -7042,7 +7210,7 @@
           <w:rFonts w:ascii="Arial" w:hAnsi="Arial"/>
           <w:sz w:val="20"/>
         </w:rPr>
-        <w:t>▪  Desarrollar el script Python: lectura, validaciones (tipos, catálogos), normalización y carga.</w:t>
+        <w:t>▪  Desarrollar el script: lectura, validaciones, normalización y carga.</w:t>
       </w:r>
     </w:p>
     <w:p>
@@ -7056,7 +7224,7 @@
           <w:rFonts w:ascii="Arial" w:hAnsi="Arial"/>
           <w:sz w:val="20"/>
         </w:rPr>
-        <w:t>▪  Programar la ejecución (job/CI) y exponer la tabla al Space; crear la vista analítica.</w:t>
+        <w:t>▪  Programar la ejecución (job/CI) y exponer la tabla; crear la vista.</w:t>
       </w:r>
     </w:p>
     <w:tbl>
@@ -7132,7 +7300,7 @@
                 <w:rFonts w:ascii="Arial" w:hAnsi="Arial"/>
                 <w:sz w:val="17"/>
               </w:rPr>
-              <w:t>Cuando hay capacidad de desarrollo y se requieren validaciones o transformación en la carga, o integración con otros procesos. Ventaja: control total e integrable. Requiere: desarrollo y gobierno de credenciales.</w:t>
+              <w:t>Cuando hay capacidad de desarrollo y se requieren validaciones/transformación o integración con otros procesos. Ventaja: control total. Requiere: desarrollo y gobierno de credenciales.</w:t>
             </w:r>
           </w:p>
         </w:tc>
@@ -7165,7 +7333,7 @@
           <w:i w:val="0"/>
           <w:sz w:val="20"/>
         </w:rPr>
-        <w:t>Una plataforma de integración (SAP Integration Suite — iFlow, o una herramienta ETL como SAP Data Intelligence o de un socio) orquesta la toma del archivo y su carga en Datasphere (vía Open SQL u Object Store), con monitoreo y reintentos.</w:t>
+        <w:t>Una plataforma de integración (SAP Integration Suite — iFlow, o una herramienta ETL como SAP Data Intelligence o de un socio) orquesta la toma del archivo y su carga en Datasphere, con monitoreo y reintentos.</w:t>
       </w:r>
     </w:p>
     <w:p>
@@ -7177,7 +7345,7 @@
         <w:drawing>
           <wp:inline>
             <wp:extent cx="6035040" cy="2448839"/>
-            <wp:docPr id="7" name="Picture 7"/>
+            <wp:docPr id="8" name="Picture 8"/>
             <wp:cNvGraphicFramePr>
               <a:graphicFrameLocks noChangeAspect="1"/>
             </wp:cNvGraphicFramePr>
@@ -7189,7 +7357,7 @@
                     <pic:cNvPicPr/>
                   </pic:nvPicPr>
                   <pic:blipFill>
-                    <a:blip r:embed="rId31"/>
+                    <a:blip r:embed="rId32"/>
                     <a:stretch>
                       <a:fillRect/>
                     </a:stretch>
@@ -7220,7 +7388,7 @@
           <w:color w:val="595959"/>
           <w:sz w:val="17"/>
         </w:rPr>
-        <w:t>Figura 5. Propuesta 4 — Orquestación con SAP Integration Suite / ETL.</w:t>
+        <w:t>Figura 6. Propuesta 4 — Orquestación con SAP Integration Suite / ETL.</w:t>
       </w:r>
     </w:p>
     <w:p>
@@ -7234,7 +7402,7 @@
           <w:rFonts w:ascii="Arial" w:hAnsi="Arial"/>
           <w:sz w:val="20"/>
         </w:rPr>
-        <w:t>▪  Construir el iFlow / pipeline que lea el archivo y lo transforme.</w:t>
+        <w:t>▪  Construir el iFlow / pipeline que lea y transforme el archivo.</w:t>
       </w:r>
     </w:p>
     <w:p>
@@ -7248,7 +7416,7 @@
           <w:rFonts w:ascii="Arial" w:hAnsi="Arial"/>
           <w:sz w:val="20"/>
         </w:rPr>
-        <w:t>▪  Cargar en Datasphere (Open SQL u Object Store) con manejo de errores y reintentos.</w:t>
+        <w:t>▪  Cargar en Datasphere (Open SQL u Object Store) con manejo de errores.</w:t>
       </w:r>
     </w:p>
     <w:p>
@@ -7262,7 +7430,7 @@
           <w:rFonts w:ascii="Arial" w:hAnsi="Arial"/>
           <w:sz w:val="20"/>
         </w:rPr>
-        <w:t>▪  Monitorear la ejecución desde la plataforma de integración.</w:t>
+        <w:t>▪  Monitorear la ejecución desde la plataforma.</w:t>
       </w:r>
     </w:p>
     <w:tbl>
@@ -7338,7 +7506,7 @@
                 <w:rFonts w:ascii="Arial" w:hAnsi="Arial"/>
                 <w:sz w:val="17"/>
               </w:rPr>
-              <w:t>Paisajes con integración corporativa ya establecida y necesidad de orquestación/monitoreo centralizados. Ventaja: gobierno y robustez. Requiere: plataforma, licencias y equipo especializado.</w:t>
+              <w:t>Paisajes con integración corporativa establecida y necesidad de orquestación/monitoreo centralizados. Requiere: plataforma, licencias y equipo especializado.</w:t>
             </w:r>
           </w:p>
         </w:tc>
@@ -7356,7 +7524,1355 @@
         <w:spacing w:before="280" w:after="120"/>
       </w:pPr>
       <w:r>
-        <w:t>Comparación de propuestas y recomendación</w:t>
+        <w:t>Propuesta recomendada (mejor opción)</w:t>
+      </w:r>
+    </w:p>
+    <w:p>
+      <w:pPr>
+        <w:spacing w:after="120"/>
+        <w:jc w:val="both"/>
+      </w:pPr>
+      <w:r>
+        <w:rPr>
+          <w:rFonts w:ascii="Arial" w:hAnsi="Arial"/>
+          <w:b w:val="0"/>
+          <w:i w:val="0"/>
+          <w:sz w:val="20"/>
+        </w:rPr>
+        <w:t>Con base en las capacidades de SAP Datasphere y en las características de este caso —archivo propiedad del negocio, carga periódica (mensual/anual) y necesidad de convivir con el real de S/4HANA—, la mejor opción para cargar el archivo es el almacenamiento en la nube (SFTP u Object Store) combinado con un Data Flow (o Replication Flow) programado en Datasphere.</w:t>
+      </w:r>
+    </w:p>
+    <w:p>
+      <w:pPr>
+        <w:spacing w:before="120" w:after="40"/>
+        <w:jc w:val="center"/>
+      </w:pPr>
+      <w:r>
+        <w:drawing>
+          <wp:inline>
+            <wp:extent cx="6035040" cy="2448839"/>
+            <wp:docPr id="9" name="Picture 9"/>
+            <wp:cNvGraphicFramePr>
+              <a:graphicFrameLocks noChangeAspect="1"/>
+            </wp:cNvGraphicFramePr>
+            <a:graphic>
+              <a:graphicData uri="http://schemas.openxmlformats.org/drawingml/2006/picture">
+                <pic:pic>
+                  <pic:nvPicPr>
+                    <pic:cNvPr id="0" name="recomendada.png"/>
+                    <pic:cNvPicPr/>
+                  </pic:nvPicPr>
+                  <pic:blipFill>
+                    <a:blip r:embed="rId33"/>
+                    <a:stretch>
+                      <a:fillRect/>
+                    </a:stretch>
+                  </pic:blipFill>
+                  <pic:spPr>
+                    <a:xfrm>
+                      <a:off x="0" y="0"/>
+                      <a:ext cx="6035040" cy="2448839"/>
+                    </a:xfrm>
+                    <a:prstGeom prst="rect"/>
+                  </pic:spPr>
+                </pic:pic>
+              </a:graphicData>
+            </a:graphic>
+          </wp:inline>
+        </w:drawing>
+      </w:r>
+    </w:p>
+    <w:p>
+      <w:pPr>
+        <w:spacing w:after="200"/>
+        <w:jc w:val="center"/>
+      </w:pPr>
+      <w:r>
+        <w:rPr>
+          <w:rFonts w:ascii="Arial" w:hAnsi="Arial"/>
+          <w:i/>
+          <w:color w:val="595959"/>
+          <w:sz w:val="17"/>
+        </w:rPr>
+        <w:t>Figura 7. Propuesta recomendada — Almacenamiento en la nube + Data Flow programado, integrado con el real.</w:t>
+      </w:r>
+    </w:p>
+    <w:p>
+      <w:pPr>
+        <w:pStyle w:val="Heading2"/>
+        <w:keepNext/>
+        <w:spacing w:before="200" w:after="80"/>
+      </w:pPr>
+      <w:r>
+        <w:t>Por qué es la mejor opción</w:t>
+      </w:r>
+    </w:p>
+    <w:p>
+      <w:pPr>
+        <w:pStyle w:val="ListParagraph"/>
+        <w:spacing w:after="40"/>
+        <w:ind w:left="432"/>
+      </w:pPr>
+      <w:r>
+        <w:rPr>
+          <w:rFonts w:ascii="Arial" w:hAnsi="Arial"/>
+          <w:sz w:val="20"/>
+        </w:rPr>
+        <w:t>▪  File-based: el negocio conserva la propiedad del archivo (Excel→CSV) y solo lo deposita; no hay paso manual en la interfaz cada periodo.</w:t>
+      </w:r>
+    </w:p>
+    <w:p>
+      <w:pPr>
+        <w:pStyle w:val="ListParagraph"/>
+        <w:spacing w:after="40"/>
+        <w:ind w:left="432"/>
+      </w:pPr>
+      <w:r>
+        <w:rPr>
+          <w:rFonts w:ascii="Arial" w:hAnsi="Arial"/>
+          <w:sz w:val="20"/>
+        </w:rPr>
+        <w:t>▪  Automatizable y programable: se ajusta al ciclo mensual/anual y deja trazabilidad de cada carga.</w:t>
+      </w:r>
+    </w:p>
+    <w:p>
+      <w:pPr>
+        <w:pStyle w:val="ListParagraph"/>
+        <w:spacing w:after="40"/>
+        <w:ind w:left="432"/>
+      </w:pPr>
+      <w:r>
+        <w:rPr>
+          <w:rFonts w:ascii="Arial" w:hAnsi="Arial"/>
+          <w:sz w:val="20"/>
+        </w:rPr>
+        <w:t>▪  Un Data Flow permite validar y normalizar (aplicabilidad por sociedad, pivoteo de meses); un Replication Flow basta si el CSV ya viene normalizado.</w:t>
+      </w:r>
+    </w:p>
+    <w:p>
+      <w:pPr>
+        <w:pStyle w:val="ListParagraph"/>
+        <w:spacing w:after="40"/>
+        <w:ind w:left="432"/>
+      </w:pPr>
+      <w:r>
+        <w:rPr>
+          <w:rFonts w:ascii="Arial" w:hAnsi="Arial"/>
+          <w:sz w:val="20"/>
+        </w:rPr>
+        <w:t>▪  Convive naturalmente con el real de S/4HANA: ambos son tablas del mismo Space, listas para la vista Real vs. Presupuesto.</w:t>
+      </w:r>
+    </w:p>
+    <w:p>
+      <w:pPr>
+        <w:pStyle w:val="ListParagraph"/>
+        <w:spacing w:after="40"/>
+        <w:ind w:left="432"/>
+      </w:pPr>
+      <w:r>
+        <w:rPr>
+          <w:rFonts w:ascii="Arial" w:hAnsi="Arial"/>
+          <w:sz w:val="20"/>
+        </w:rPr>
+        <w:t>▪  Menor costo y complejidad que una plataforma de integración completa, y menos propenso a error que la carga manual.</w:t>
+      </w:r>
+    </w:p>
+    <w:p>
+      <w:pPr>
+        <w:pStyle w:val="Heading2"/>
+        <w:keepNext/>
+        <w:spacing w:before="200" w:after="80"/>
+      </w:pPr>
+      <w:r>
+        <w:t>Pasos de implementación</w:t>
+      </w:r>
+    </w:p>
+    <w:tbl>
+      <w:tblPr>
+        <w:tblStyle w:val="Fanalca"/>
+        <w:tblW w:type="auto" w:w="0"/>
+        <w:jc w:val="center"/>
+        <w:tblLayout w:type="fixed"/>
+        <w:tblLook w:firstColumn="1" w:firstRow="1" w:lastColumn="0" w:lastRow="0" w:noHBand="0" w:noVBand="1" w:val="04A0"/>
+        <w:tblLayout w:type="fixed"/>
+      </w:tblPr>
+      <w:tblGrid>
+        <w:gridCol w:w="3169"/>
+        <w:gridCol w:w="3169"/>
+        <w:gridCol w:w="3169"/>
+      </w:tblGrid>
+      <w:tr>
+        <w:trPr>
+          <w:tblHeader w:val="true"/>
+          <w:cantSplit w:val="true"/>
+        </w:trPr>
+        <w:tc>
+          <w:tcPr>
+            <w:tcW w:type="dxa" w:w="720"/>
+            <w:shd w:val="clear" w:color="auto" w:fill="1F3864"/>
+            <w:vAlign w:val="center"/>
+            <w:tcMar>
+              <w:top w:w="40" w:type="dxa"/>
+              <w:bottom w:w="40" w:type="dxa"/>
+              <w:start w:w="80" w:type="dxa"/>
+              <w:end w:w="80" w:type="dxa"/>
+            </w:tcMar>
+          </w:tcPr>
+          <w:p>
+            <w:pPr>
+              <w:spacing w:after="20" w:before="20"/>
+              <w:jc w:val="center"/>
+            </w:pPr>
+            <w:r>
+              <w:rPr>
+                <w:rFonts w:ascii="Arial" w:hAnsi="Arial"/>
+                <w:b/>
+                <w:i w:val="0"/>
+                <w:color w:val="FFFFFF"/>
+                <w:sz w:val="17"/>
+              </w:rPr>
+              <w:t>#</w:t>
+            </w:r>
+          </w:p>
+        </w:tc>
+        <w:tc>
+          <w:tcPr>
+            <w:tcW w:type="dxa" w:w="2736"/>
+            <w:shd w:val="clear" w:color="auto" w:fill="1F3864"/>
+            <w:vAlign w:val="center"/>
+            <w:tcMar>
+              <w:top w:w="40" w:type="dxa"/>
+              <w:bottom w:w="40" w:type="dxa"/>
+              <w:start w:w="80" w:type="dxa"/>
+              <w:end w:w="80" w:type="dxa"/>
+            </w:tcMar>
+          </w:tcPr>
+          <w:p>
+            <w:pPr>
+              <w:spacing w:after="20" w:before="20"/>
+              <w:jc w:val="center"/>
+            </w:pPr>
+            <w:r>
+              <w:rPr>
+                <w:rFonts w:ascii="Arial" w:hAnsi="Arial"/>
+                <w:b/>
+                <w:i w:val="0"/>
+                <w:color w:val="FFFFFF"/>
+                <w:sz w:val="17"/>
+              </w:rPr>
+              <w:t>Paso</w:t>
+            </w:r>
+          </w:p>
+        </w:tc>
+        <w:tc>
+          <w:tcPr>
+            <w:tcW w:type="dxa" w:w="6048"/>
+            <w:shd w:val="clear" w:color="auto" w:fill="1F3864"/>
+            <w:vAlign w:val="center"/>
+            <w:tcMar>
+              <w:top w:w="40" w:type="dxa"/>
+              <w:bottom w:w="40" w:type="dxa"/>
+              <w:start w:w="80" w:type="dxa"/>
+              <w:end w:w="80" w:type="dxa"/>
+            </w:tcMar>
+          </w:tcPr>
+          <w:p>
+            <w:pPr>
+              <w:spacing w:after="20" w:before="20"/>
+              <w:jc w:val="center"/>
+            </w:pPr>
+            <w:r>
+              <w:rPr>
+                <w:rFonts w:ascii="Arial" w:hAnsi="Arial"/>
+                <w:b/>
+                <w:i w:val="0"/>
+                <w:color w:val="FFFFFF"/>
+                <w:sz w:val="17"/>
+              </w:rPr>
+              <w:t>Detalle</w:t>
+            </w:r>
+          </w:p>
+        </w:tc>
+      </w:tr>
+      <w:tr>
+        <w:tc>
+          <w:tcPr>
+            <w:tcW w:type="dxa" w:w="720"/>
+            <w:vAlign w:val="center"/>
+            <w:tcMar>
+              <w:top w:w="40" w:type="dxa"/>
+              <w:bottom w:w="40" w:type="dxa"/>
+              <w:start w:w="80" w:type="dxa"/>
+              <w:end w:w="80" w:type="dxa"/>
+            </w:tcMar>
+          </w:tcPr>
+          <w:p>
+            <w:pPr>
+              <w:spacing w:after="20" w:before="20"/>
+              <w:jc w:val="left"/>
+            </w:pPr>
+            <w:r>
+              <w:rPr>
+                <w:rFonts w:ascii="Arial" w:hAnsi="Arial"/>
+                <w:b w:val="0"/>
+                <w:i w:val="0"/>
+                <w:sz w:val="16"/>
+              </w:rPr>
+              <w:t>1</w:t>
+            </w:r>
+          </w:p>
+        </w:tc>
+        <w:tc>
+          <w:tcPr>
+            <w:tcW w:type="dxa" w:w="2736"/>
+            <w:vAlign w:val="center"/>
+            <w:tcMar>
+              <w:top w:w="40" w:type="dxa"/>
+              <w:bottom w:w="40" w:type="dxa"/>
+              <w:start w:w="80" w:type="dxa"/>
+              <w:end w:w="80" w:type="dxa"/>
+            </w:tcMar>
+          </w:tcPr>
+          <w:p>
+            <w:pPr>
+              <w:spacing w:after="20" w:before="20"/>
+              <w:jc w:val="left"/>
+            </w:pPr>
+            <w:r>
+              <w:rPr>
+                <w:rFonts w:ascii="Arial" w:hAnsi="Arial"/>
+                <w:b w:val="0"/>
+                <w:i w:val="0"/>
+                <w:sz w:val="16"/>
+              </w:rPr>
+              <w:t>Convención de archivos</w:t>
+            </w:r>
+          </w:p>
+        </w:tc>
+        <w:tc>
+          <w:tcPr>
+            <w:tcW w:type="dxa" w:w="6048"/>
+            <w:vAlign w:val="center"/>
+            <w:tcMar>
+              <w:top w:w="40" w:type="dxa"/>
+              <w:bottom w:w="40" w:type="dxa"/>
+              <w:start w:w="80" w:type="dxa"/>
+              <w:end w:w="80" w:type="dxa"/>
+            </w:tcMar>
+          </w:tcPr>
+          <w:p>
+            <w:pPr>
+              <w:spacing w:after="20" w:before="20"/>
+              <w:jc w:val="left"/>
+            </w:pPr>
+            <w:r>
+              <w:rPr>
+                <w:rFonts w:ascii="Arial" w:hAnsi="Arial"/>
+                <w:b w:val="0"/>
+                <w:i w:val="0"/>
+                <w:sz w:val="16"/>
+              </w:rPr>
+              <w:t>Nombrar los archivos por sociedad/año/mes, p. ej. PPTO_COM_&lt;sociedad&gt;_&lt;AAAA&gt;_&lt;MM&gt;.csv.</w:t>
+            </w:r>
+          </w:p>
+        </w:tc>
+      </w:tr>
+      <w:tr>
+        <w:tc>
+          <w:tcPr>
+            <w:tcW w:type="dxa" w:w="720"/>
+            <w:vAlign w:val="center"/>
+            <w:tcMar>
+              <w:top w:w="40" w:type="dxa"/>
+              <w:bottom w:w="40" w:type="dxa"/>
+              <w:start w:w="80" w:type="dxa"/>
+              <w:end w:w="80" w:type="dxa"/>
+            </w:tcMar>
+            <w:shd w:val="clear" w:color="auto" w:fill="F2F6FC"/>
+          </w:tcPr>
+          <w:p>
+            <w:pPr>
+              <w:spacing w:after="20" w:before="20"/>
+              <w:jc w:val="left"/>
+            </w:pPr>
+            <w:r>
+              <w:rPr>
+                <w:rFonts w:ascii="Arial" w:hAnsi="Arial"/>
+                <w:b w:val="0"/>
+                <w:i w:val="0"/>
+                <w:sz w:val="16"/>
+              </w:rPr>
+              <w:t>2</w:t>
+            </w:r>
+          </w:p>
+        </w:tc>
+        <w:tc>
+          <w:tcPr>
+            <w:tcW w:type="dxa" w:w="2736"/>
+            <w:vAlign w:val="center"/>
+            <w:tcMar>
+              <w:top w:w="40" w:type="dxa"/>
+              <w:bottom w:w="40" w:type="dxa"/>
+              <w:start w:w="80" w:type="dxa"/>
+              <w:end w:w="80" w:type="dxa"/>
+            </w:tcMar>
+            <w:shd w:val="clear" w:color="auto" w:fill="F2F6FC"/>
+          </w:tcPr>
+          <w:p>
+            <w:pPr>
+              <w:spacing w:after="20" w:before="20"/>
+              <w:jc w:val="left"/>
+            </w:pPr>
+            <w:r>
+              <w:rPr>
+                <w:rFonts w:ascii="Arial" w:hAnsi="Arial"/>
+                <w:b w:val="0"/>
+                <w:i w:val="0"/>
+                <w:sz w:val="16"/>
+              </w:rPr>
+              <w:t>Almacenamiento</w:t>
+            </w:r>
+          </w:p>
+        </w:tc>
+        <w:tc>
+          <w:tcPr>
+            <w:tcW w:type="dxa" w:w="6048"/>
+            <w:vAlign w:val="center"/>
+            <w:tcMar>
+              <w:top w:w="40" w:type="dxa"/>
+              <w:bottom w:w="40" w:type="dxa"/>
+              <w:start w:w="80" w:type="dxa"/>
+              <w:end w:w="80" w:type="dxa"/>
+            </w:tcMar>
+            <w:shd w:val="clear" w:color="auto" w:fill="F2F6FC"/>
+          </w:tcPr>
+          <w:p>
+            <w:pPr>
+              <w:spacing w:after="20" w:before="20"/>
+              <w:jc w:val="left"/>
+            </w:pPr>
+            <w:r>
+              <w:rPr>
+                <w:rFonts w:ascii="Arial" w:hAnsi="Arial"/>
+                <w:b w:val="0"/>
+                <w:i w:val="0"/>
+                <w:sz w:val="16"/>
+              </w:rPr>
+              <w:t>Aprovisionar SFTP u Object Store (S3 / Azure Blob / GCS) y sus credenciales (gobernadas por TI).</w:t>
+            </w:r>
+          </w:p>
+        </w:tc>
+      </w:tr>
+      <w:tr>
+        <w:tc>
+          <w:tcPr>
+            <w:tcW w:type="dxa" w:w="720"/>
+            <w:vAlign w:val="center"/>
+            <w:tcMar>
+              <w:top w:w="40" w:type="dxa"/>
+              <w:bottom w:w="40" w:type="dxa"/>
+              <w:start w:w="80" w:type="dxa"/>
+              <w:end w:w="80" w:type="dxa"/>
+            </w:tcMar>
+          </w:tcPr>
+          <w:p>
+            <w:pPr>
+              <w:spacing w:after="20" w:before="20"/>
+              <w:jc w:val="left"/>
+            </w:pPr>
+            <w:r>
+              <w:rPr>
+                <w:rFonts w:ascii="Arial" w:hAnsi="Arial"/>
+                <w:b w:val="0"/>
+                <w:i w:val="0"/>
+                <w:sz w:val="16"/>
+              </w:rPr>
+              <w:t>3</w:t>
+            </w:r>
+          </w:p>
+        </w:tc>
+        <w:tc>
+          <w:tcPr>
+            <w:tcW w:type="dxa" w:w="2736"/>
+            <w:vAlign w:val="center"/>
+            <w:tcMar>
+              <w:top w:w="40" w:type="dxa"/>
+              <w:bottom w:w="40" w:type="dxa"/>
+              <w:start w:w="80" w:type="dxa"/>
+              <w:end w:w="80" w:type="dxa"/>
+            </w:tcMar>
+          </w:tcPr>
+          <w:p>
+            <w:pPr>
+              <w:spacing w:after="20" w:before="20"/>
+              <w:jc w:val="left"/>
+            </w:pPr>
+            <w:r>
+              <w:rPr>
+                <w:rFonts w:ascii="Arial" w:hAnsi="Arial"/>
+                <w:b w:val="0"/>
+                <w:i w:val="0"/>
+                <w:sz w:val="16"/>
+              </w:rPr>
+              <w:t>Conexión</w:t>
+            </w:r>
+          </w:p>
+        </w:tc>
+        <w:tc>
+          <w:tcPr>
+            <w:tcW w:type="dxa" w:w="6048"/>
+            <w:vAlign w:val="center"/>
+            <w:tcMar>
+              <w:top w:w="40" w:type="dxa"/>
+              <w:bottom w:w="40" w:type="dxa"/>
+              <w:start w:w="80" w:type="dxa"/>
+              <w:end w:w="80" w:type="dxa"/>
+            </w:tcMar>
+          </w:tcPr>
+          <w:p>
+            <w:pPr>
+              <w:spacing w:after="20" w:before="20"/>
+              <w:jc w:val="left"/>
+            </w:pPr>
+            <w:r>
+              <w:rPr>
+                <w:rFonts w:ascii="Arial" w:hAnsi="Arial"/>
+                <w:b w:val="0"/>
+                <w:i w:val="0"/>
+                <w:sz w:val="16"/>
+              </w:rPr>
+              <w:t>Crear la conexión de almacenamiento en SAP Datasphere.</w:t>
+            </w:r>
+          </w:p>
+        </w:tc>
+      </w:tr>
+      <w:tr>
+        <w:tc>
+          <w:tcPr>
+            <w:tcW w:type="dxa" w:w="720"/>
+            <w:vAlign w:val="center"/>
+            <w:tcMar>
+              <w:top w:w="40" w:type="dxa"/>
+              <w:bottom w:w="40" w:type="dxa"/>
+              <w:start w:w="80" w:type="dxa"/>
+              <w:end w:w="80" w:type="dxa"/>
+            </w:tcMar>
+            <w:shd w:val="clear" w:color="auto" w:fill="F2F6FC"/>
+          </w:tcPr>
+          <w:p>
+            <w:pPr>
+              <w:spacing w:after="20" w:before="20"/>
+              <w:jc w:val="left"/>
+            </w:pPr>
+            <w:r>
+              <w:rPr>
+                <w:rFonts w:ascii="Arial" w:hAnsi="Arial"/>
+                <w:b w:val="0"/>
+                <w:i w:val="0"/>
+                <w:sz w:val="16"/>
+              </w:rPr>
+              <w:t>4</w:t>
+            </w:r>
+          </w:p>
+        </w:tc>
+        <w:tc>
+          <w:tcPr>
+            <w:tcW w:type="dxa" w:w="2736"/>
+            <w:vAlign w:val="center"/>
+            <w:tcMar>
+              <w:top w:w="40" w:type="dxa"/>
+              <w:bottom w:w="40" w:type="dxa"/>
+              <w:start w:w="80" w:type="dxa"/>
+              <w:end w:w="80" w:type="dxa"/>
+            </w:tcMar>
+            <w:shd w:val="clear" w:color="auto" w:fill="F2F6FC"/>
+          </w:tcPr>
+          <w:p>
+            <w:pPr>
+              <w:spacing w:after="20" w:before="20"/>
+              <w:jc w:val="left"/>
+            </w:pPr>
+            <w:r>
+              <w:rPr>
+                <w:rFonts w:ascii="Arial" w:hAnsi="Arial"/>
+                <w:b w:val="0"/>
+                <w:i w:val="0"/>
+                <w:sz w:val="16"/>
+              </w:rPr>
+              <w:t>Data Flow</w:t>
+            </w:r>
+          </w:p>
+        </w:tc>
+        <w:tc>
+          <w:tcPr>
+            <w:tcW w:type="dxa" w:w="6048"/>
+            <w:vAlign w:val="center"/>
+            <w:tcMar>
+              <w:top w:w="40" w:type="dxa"/>
+              <w:bottom w:w="40" w:type="dxa"/>
+              <w:start w:w="80" w:type="dxa"/>
+              <w:end w:w="80" w:type="dxa"/>
+            </w:tcMar>
+            <w:shd w:val="clear" w:color="auto" w:fill="F2F6FC"/>
+          </w:tcPr>
+          <w:p>
+            <w:pPr>
+              <w:spacing w:after="20" w:before="20"/>
+              <w:jc w:val="left"/>
+            </w:pPr>
+            <w:r>
+              <w:rPr>
+                <w:rFonts w:ascii="Arial" w:hAnsi="Arial"/>
+                <w:b w:val="0"/>
+                <w:i w:val="0"/>
+                <w:sz w:val="16"/>
+              </w:rPr>
+              <w:t>Origen archivo → validaciones (tipos, catálogos, aplicabilidad) → normalización (pivotear meses si el archivo es ancho) → Tabla Presupuesto (VERSION = «Presupuesto»).</w:t>
+            </w:r>
+          </w:p>
+        </w:tc>
+      </w:tr>
+      <w:tr>
+        <w:tc>
+          <w:tcPr>
+            <w:tcW w:type="dxa" w:w="720"/>
+            <w:vAlign w:val="center"/>
+            <w:tcMar>
+              <w:top w:w="40" w:type="dxa"/>
+              <w:bottom w:w="40" w:type="dxa"/>
+              <w:start w:w="80" w:type="dxa"/>
+              <w:end w:w="80" w:type="dxa"/>
+            </w:tcMar>
+          </w:tcPr>
+          <w:p>
+            <w:pPr>
+              <w:spacing w:after="20" w:before="20"/>
+              <w:jc w:val="left"/>
+            </w:pPr>
+            <w:r>
+              <w:rPr>
+                <w:rFonts w:ascii="Arial" w:hAnsi="Arial"/>
+                <w:b w:val="0"/>
+                <w:i w:val="0"/>
+                <w:sz w:val="16"/>
+              </w:rPr>
+              <w:t>5</w:t>
+            </w:r>
+          </w:p>
+        </w:tc>
+        <w:tc>
+          <w:tcPr>
+            <w:tcW w:type="dxa" w:w="2736"/>
+            <w:vAlign w:val="center"/>
+            <w:tcMar>
+              <w:top w:w="40" w:type="dxa"/>
+              <w:bottom w:w="40" w:type="dxa"/>
+              <w:start w:w="80" w:type="dxa"/>
+              <w:end w:w="80" w:type="dxa"/>
+            </w:tcMar>
+          </w:tcPr>
+          <w:p>
+            <w:pPr>
+              <w:spacing w:after="20" w:before="20"/>
+              <w:jc w:val="left"/>
+            </w:pPr>
+            <w:r>
+              <w:rPr>
+                <w:rFonts w:ascii="Arial" w:hAnsi="Arial"/>
+                <w:b w:val="0"/>
+                <w:i w:val="0"/>
+                <w:sz w:val="16"/>
+              </w:rPr>
+              <w:t>Programación y recarga</w:t>
+            </w:r>
+          </w:p>
+        </w:tc>
+        <w:tc>
+          <w:tcPr>
+            <w:tcW w:type="dxa" w:w="6048"/>
+            <w:vAlign w:val="center"/>
+            <w:tcMar>
+              <w:top w:w="40" w:type="dxa"/>
+              <w:bottom w:w="40" w:type="dxa"/>
+              <w:start w:w="80" w:type="dxa"/>
+              <w:end w:w="80" w:type="dxa"/>
+            </w:tcMar>
+          </w:tcPr>
+          <w:p>
+            <w:pPr>
+              <w:spacing w:after="20" w:before="20"/>
+              <w:jc w:val="left"/>
+            </w:pPr>
+            <w:r>
+              <w:rPr>
+                <w:rFonts w:ascii="Arial" w:hAnsi="Arial"/>
+                <w:b w:val="0"/>
+                <w:i w:val="0"/>
+                <w:sz w:val="16"/>
+              </w:rPr>
+              <w:t>Programar por periodo y definir la estrategia de recarga (reemplazo por sociedad/periodo o upsert) para evitar duplicados.</w:t>
+            </w:r>
+          </w:p>
+        </w:tc>
+      </w:tr>
+      <w:tr>
+        <w:tc>
+          <w:tcPr>
+            <w:tcW w:type="dxa" w:w="720"/>
+            <w:vAlign w:val="center"/>
+            <w:tcMar>
+              <w:top w:w="40" w:type="dxa"/>
+              <w:bottom w:w="40" w:type="dxa"/>
+              <w:start w:w="80" w:type="dxa"/>
+              <w:end w:w="80" w:type="dxa"/>
+            </w:tcMar>
+            <w:shd w:val="clear" w:color="auto" w:fill="F2F6FC"/>
+          </w:tcPr>
+          <w:p>
+            <w:pPr>
+              <w:spacing w:after="20" w:before="20"/>
+              <w:jc w:val="left"/>
+            </w:pPr>
+            <w:r>
+              <w:rPr>
+                <w:rFonts w:ascii="Arial" w:hAnsi="Arial"/>
+                <w:b w:val="0"/>
+                <w:i w:val="0"/>
+                <w:sz w:val="16"/>
+              </w:rPr>
+              <w:t>6</w:t>
+            </w:r>
+          </w:p>
+        </w:tc>
+        <w:tc>
+          <w:tcPr>
+            <w:tcW w:type="dxa" w:w="2736"/>
+            <w:vAlign w:val="center"/>
+            <w:tcMar>
+              <w:top w:w="40" w:type="dxa"/>
+              <w:bottom w:w="40" w:type="dxa"/>
+              <w:start w:w="80" w:type="dxa"/>
+              <w:end w:w="80" w:type="dxa"/>
+            </w:tcMar>
+            <w:shd w:val="clear" w:color="auto" w:fill="F2F6FC"/>
+          </w:tcPr>
+          <w:p>
+            <w:pPr>
+              <w:spacing w:after="20" w:before="20"/>
+              <w:jc w:val="left"/>
+            </w:pPr>
+            <w:r>
+              <w:rPr>
+                <w:rFonts w:ascii="Arial" w:hAnsi="Arial"/>
+                <w:b w:val="0"/>
+                <w:i w:val="0"/>
+                <w:sz w:val="16"/>
+              </w:rPr>
+              <w:t>Vista Real vs. Presupuesto</w:t>
+            </w:r>
+          </w:p>
+        </w:tc>
+        <w:tc>
+          <w:tcPr>
+            <w:tcW w:type="dxa" w:w="6048"/>
+            <w:vAlign w:val="center"/>
+            <w:tcMar>
+              <w:top w:w="40" w:type="dxa"/>
+              <w:bottom w:w="40" w:type="dxa"/>
+              <w:start w:w="80" w:type="dxa"/>
+              <w:end w:w="80" w:type="dxa"/>
+            </w:tcMar>
+            <w:shd w:val="clear" w:color="auto" w:fill="F2F6FC"/>
+          </w:tcPr>
+          <w:p>
+            <w:pPr>
+              <w:spacing w:after="20" w:before="20"/>
+              <w:jc w:val="left"/>
+            </w:pPr>
+            <w:r>
+              <w:rPr>
+                <w:rFonts w:ascii="Arial" w:hAnsi="Arial"/>
+                <w:b w:val="0"/>
+                <w:i w:val="0"/>
+                <w:sz w:val="16"/>
+              </w:rPr>
+              <w:t>Combinar la Tabla Presupuesto con la Tabla Real (S/4HANA) por sociedad, periodo y dimensiones comunes.</w:t>
+            </w:r>
+          </w:p>
+        </w:tc>
+      </w:tr>
+      <w:tr>
+        <w:tc>
+          <w:tcPr>
+            <w:tcW w:type="dxa" w:w="720"/>
+            <w:vAlign w:val="center"/>
+            <w:tcMar>
+              <w:top w:w="40" w:type="dxa"/>
+              <w:bottom w:w="40" w:type="dxa"/>
+              <w:start w:w="80" w:type="dxa"/>
+              <w:end w:w="80" w:type="dxa"/>
+            </w:tcMar>
+          </w:tcPr>
+          <w:p>
+            <w:pPr>
+              <w:spacing w:after="20" w:before="20"/>
+              <w:jc w:val="left"/>
+            </w:pPr>
+            <w:r>
+              <w:rPr>
+                <w:rFonts w:ascii="Arial" w:hAnsi="Arial"/>
+                <w:b w:val="0"/>
+                <w:i w:val="0"/>
+                <w:sz w:val="16"/>
+              </w:rPr>
+              <w:t>7</w:t>
+            </w:r>
+          </w:p>
+        </w:tc>
+        <w:tc>
+          <w:tcPr>
+            <w:tcW w:type="dxa" w:w="2736"/>
+            <w:vAlign w:val="center"/>
+            <w:tcMar>
+              <w:top w:w="40" w:type="dxa"/>
+              <w:bottom w:w="40" w:type="dxa"/>
+              <w:start w:w="80" w:type="dxa"/>
+              <w:end w:w="80" w:type="dxa"/>
+            </w:tcMar>
+          </w:tcPr>
+          <w:p>
+            <w:pPr>
+              <w:spacing w:after="20" w:before="20"/>
+              <w:jc w:val="left"/>
+            </w:pPr>
+            <w:r>
+              <w:rPr>
+                <w:rFonts w:ascii="Arial" w:hAnsi="Arial"/>
+                <w:b w:val="0"/>
+                <w:i w:val="0"/>
+                <w:sz w:val="16"/>
+              </w:rPr>
+              <w:t>Consumo</w:t>
+            </w:r>
+          </w:p>
+        </w:tc>
+        <w:tc>
+          <w:tcPr>
+            <w:tcW w:type="dxa" w:w="6048"/>
+            <w:vAlign w:val="center"/>
+            <w:tcMar>
+              <w:top w:w="40" w:type="dxa"/>
+              <w:bottom w:w="40" w:type="dxa"/>
+              <w:start w:w="80" w:type="dxa"/>
+              <w:end w:w="80" w:type="dxa"/>
+            </w:tcMar>
+          </w:tcPr>
+          <w:p>
+            <w:pPr>
+              <w:spacing w:after="20" w:before="20"/>
+              <w:jc w:val="left"/>
+            </w:pPr>
+            <w:r>
+              <w:rPr>
+                <w:rFonts w:ascii="Arial" w:hAnsi="Arial"/>
+                <w:b w:val="0"/>
+                <w:i w:val="0"/>
+                <w:sz w:val="16"/>
+              </w:rPr>
+              <w:t>Exponer la vista y conectar el consumo en Power BI o SAC.</w:t>
+            </w:r>
+          </w:p>
+        </w:tc>
+      </w:tr>
+    </w:tbl>
+    <w:p>
+      <w:pPr>
+        <w:spacing w:after="80" w:before="0"/>
+      </w:pPr>
+    </w:p>
+    <w:tbl>
+      <w:tblPr>
+        <w:tblStyle w:val="TableGrid"/>
+        <w:tblW w:type="auto" w:w="0"/>
+        <w:jc w:val="center"/>
+        <w:tblLayout w:type="fixed"/>
+        <w:tblLook w:firstColumn="1" w:firstRow="1" w:lastColumn="0" w:lastRow="0" w:noHBand="0" w:noVBand="1" w:val="04A0"/>
+        <w:tblLayout w:type="fixed"/>
+        <w:tblBorders>
+          <w:top w:val="single" w:sz="8" w:space="0" w:color="2E5496"/>
+          <w:left w:val="single" w:sz="8" w:space="0" w:color="2E5496"/>
+          <w:bottom w:val="single" w:sz="8" w:space="0" w:color="2E5496"/>
+          <w:right w:val="single" w:sz="8" w:space="0" w:color="2E5496"/>
+          <w:insideH w:val="single" w:sz="8" w:space="0" w:color="2E5496"/>
+          <w:insideV w:val="single" w:sz="8" w:space="0" w:color="2E5496"/>
+        </w:tblBorders>
+      </w:tblPr>
+      <w:tblGrid>
+        <w:gridCol w:w="9506"/>
+      </w:tblGrid>
+      <w:tr>
+        <w:tc>
+          <w:tcPr>
+            <w:tcW w:type="dxa" w:w="9504"/>
+            <w:shd w:val="clear" w:color="auto" w:fill="2E5496"/>
+            <w:vAlign w:val="center"/>
+            <w:tcMar>
+              <w:top w:w="50" w:type="dxa"/>
+              <w:bottom w:w="50" w:type="dxa"/>
+              <w:start w:w="80" w:type="dxa"/>
+              <w:end w:w="80" w:type="dxa"/>
+            </w:tcMar>
+          </w:tcPr>
+          <w:p>
+            <w:pPr>
+              <w:spacing w:after="20" w:before="20"/>
+              <w:jc w:val="left"/>
+            </w:pPr>
+            <w:r>
+              <w:rPr>
+                <w:rFonts w:ascii="Arial" w:hAnsi="Arial"/>
+                <w:b/>
+                <w:i w:val="0"/>
+                <w:color w:val="FFFFFF"/>
+                <w:sz w:val="18"/>
+              </w:rPr>
+              <w:t>●  Cuándo optar por otra opción</w:t>
+            </w:r>
+          </w:p>
+        </w:tc>
+      </w:tr>
+      <w:tr>
+        <w:tc>
+          <w:tcPr>
+            <w:tcW w:type="dxa" w:w="9504"/>
+            <w:shd w:val="clear" w:color="auto" w:fill="EAF1FB"/>
+            <w:vAlign w:val="center"/>
+            <w:tcMar>
+              <w:top w:w="60" w:type="dxa"/>
+              <w:bottom w:w="60" w:type="dxa"/>
+              <w:start w:w="80" w:type="dxa"/>
+              <w:end w:w="80" w:type="dxa"/>
+            </w:tcMar>
+          </w:tcPr>
+          <w:p>
+            <w:pPr>
+              <w:spacing w:after="40" w:before="0"/>
+            </w:pPr>
+            <w:r>
+              <w:rPr>
+                <w:rFonts w:ascii="Arial" w:hAnsi="Arial"/>
+                <w:sz w:val="17"/>
+              </w:rPr>
+              <w:t>Si la lógica de validación/normalización es muy compleja o se requiere integración con otros procesos, usar la Propuesta 3 (Open SQL + Python). Para la primera carga o un piloto rápido, la Propuesta 1 (carga manual).</w:t>
+            </w:r>
+          </w:p>
+        </w:tc>
+      </w:tr>
+    </w:tbl>
+    <w:p>
+      <w:pPr>
+        <w:spacing w:after="120" w:before="0"/>
+      </w:pPr>
+    </w:p>
+    <w:p>
+      <w:pPr>
+        <w:pStyle w:val="Heading1"/>
+        <w:keepNext/>
+        <w:spacing w:before="280" w:after="120"/>
+      </w:pPr>
+      <w:r>
+        <w:t>Consumo y reportes: Real vs. Presupuesto en Power BI o SAC</w:t>
+      </w:r>
+    </w:p>
+    <w:p>
+      <w:pPr>
+        <w:spacing w:after="120"/>
+        <w:jc w:val="both"/>
+      </w:pPr>
+      <w:r>
+        <w:rPr>
+          <w:rFonts w:ascii="Arial" w:hAnsi="Arial"/>
+          <w:b w:val="0"/>
+          <w:i w:val="0"/>
+          <w:sz w:val="20"/>
+        </w:rPr>
+        <w:t>La vista «Real vs. Presupuesto» de Datasphere se consume desde Power BI o desde SAP Analytics Cloud, según la herramienta que use cada área. El reporte compara Real y Presupuesto por sociedad, periodo y dimensiones comunes, con la variación en $ y %.</w:t>
+      </w:r>
+    </w:p>
+    <w:tbl>
+      <w:tblPr>
+        <w:tblStyle w:val="Fanalca"/>
+        <w:tblW w:type="auto" w:w="0"/>
+        <w:jc w:val="center"/>
+        <w:tblLayout w:type="fixed"/>
+        <w:tblLook w:firstColumn="1" w:firstRow="1" w:lastColumn="0" w:lastRow="0" w:noHBand="0" w:noVBand="1" w:val="04A0"/>
+        <w:tblLayout w:type="fixed"/>
+      </w:tblPr>
+      <w:tblGrid>
+        <w:gridCol w:w="3169"/>
+        <w:gridCol w:w="3169"/>
+        <w:gridCol w:w="3169"/>
+      </w:tblGrid>
+      <w:tr>
+        <w:trPr>
+          <w:tblHeader w:val="true"/>
+          <w:cantSplit w:val="true"/>
+        </w:trPr>
+        <w:tc>
+          <w:tcPr>
+            <w:tcW w:type="dxa" w:w="2160"/>
+            <w:shd w:val="clear" w:color="auto" w:fill="1F3864"/>
+            <w:vAlign w:val="center"/>
+            <w:tcMar>
+              <w:top w:w="40" w:type="dxa"/>
+              <w:bottom w:w="40" w:type="dxa"/>
+              <w:start w:w="80" w:type="dxa"/>
+              <w:end w:w="80" w:type="dxa"/>
+            </w:tcMar>
+          </w:tcPr>
+          <w:p>
+            <w:pPr>
+              <w:spacing w:after="20" w:before="20"/>
+              <w:jc w:val="center"/>
+            </w:pPr>
+            <w:r>
+              <w:rPr>
+                <w:rFonts w:ascii="Arial" w:hAnsi="Arial"/>
+                <w:b/>
+                <w:i w:val="0"/>
+                <w:color w:val="FFFFFF"/>
+                <w:sz w:val="17"/>
+              </w:rPr>
+              <w:t>Herramienta</w:t>
+            </w:r>
+          </w:p>
+        </w:tc>
+        <w:tc>
+          <w:tcPr>
+            <w:tcW w:type="dxa" w:w="4752"/>
+            <w:shd w:val="clear" w:color="auto" w:fill="1F3864"/>
+            <w:vAlign w:val="center"/>
+            <w:tcMar>
+              <w:top w:w="40" w:type="dxa"/>
+              <w:bottom w:w="40" w:type="dxa"/>
+              <w:start w:w="80" w:type="dxa"/>
+              <w:end w:w="80" w:type="dxa"/>
+            </w:tcMar>
+          </w:tcPr>
+          <w:p>
+            <w:pPr>
+              <w:spacing w:after="20" w:before="20"/>
+              <w:jc w:val="center"/>
+            </w:pPr>
+            <w:r>
+              <w:rPr>
+                <w:rFonts w:ascii="Arial" w:hAnsi="Arial"/>
+                <w:b/>
+                <w:i w:val="0"/>
+                <w:color w:val="FFFFFF"/>
+                <w:sz w:val="17"/>
+              </w:rPr>
+              <w:t>Método de conexión</w:t>
+            </w:r>
+          </w:p>
+        </w:tc>
+        <w:tc>
+          <w:tcPr>
+            <w:tcW w:type="dxa" w:w="2592"/>
+            <w:shd w:val="clear" w:color="auto" w:fill="1F3864"/>
+            <w:vAlign w:val="center"/>
+            <w:tcMar>
+              <w:top w:w="40" w:type="dxa"/>
+              <w:bottom w:w="40" w:type="dxa"/>
+              <w:start w:w="80" w:type="dxa"/>
+              <w:end w:w="80" w:type="dxa"/>
+            </w:tcMar>
+          </w:tcPr>
+          <w:p>
+            <w:pPr>
+              <w:spacing w:after="20" w:before="20"/>
+              <w:jc w:val="center"/>
+            </w:pPr>
+            <w:r>
+              <w:rPr>
+                <w:rFonts w:ascii="Arial" w:hAnsi="Arial"/>
+                <w:b/>
+                <w:i w:val="0"/>
+                <w:color w:val="FFFFFF"/>
+                <w:sz w:val="17"/>
+              </w:rPr>
+              <w:t>Uso</w:t>
+            </w:r>
+          </w:p>
+        </w:tc>
+      </w:tr>
+      <w:tr>
+        <w:tc>
+          <w:tcPr>
+            <w:tcW w:type="dxa" w:w="2160"/>
+            <w:vAlign w:val="center"/>
+            <w:tcMar>
+              <w:top w:w="40" w:type="dxa"/>
+              <w:bottom w:w="40" w:type="dxa"/>
+              <w:start w:w="80" w:type="dxa"/>
+              <w:end w:w="80" w:type="dxa"/>
+            </w:tcMar>
+          </w:tcPr>
+          <w:p>
+            <w:pPr>
+              <w:spacing w:after="20" w:before="20"/>
+              <w:jc w:val="left"/>
+            </w:pPr>
+            <w:r>
+              <w:rPr>
+                <w:rFonts w:ascii="Arial" w:hAnsi="Arial"/>
+                <w:b w:val="0"/>
+                <w:i w:val="0"/>
+                <w:sz w:val="16"/>
+              </w:rPr>
+              <w:t>Power BI</w:t>
+            </w:r>
+          </w:p>
+        </w:tc>
+        <w:tc>
+          <w:tcPr>
+            <w:tcW w:type="dxa" w:w="4752"/>
+            <w:vAlign w:val="center"/>
+            <w:tcMar>
+              <w:top w:w="40" w:type="dxa"/>
+              <w:bottom w:w="40" w:type="dxa"/>
+              <w:start w:w="80" w:type="dxa"/>
+              <w:end w:w="80" w:type="dxa"/>
+            </w:tcMar>
+          </w:tcPr>
+          <w:p>
+            <w:pPr>
+              <w:spacing w:after="20" w:before="20"/>
+              <w:jc w:val="left"/>
+            </w:pPr>
+            <w:r>
+              <w:rPr>
+                <w:rFonts w:ascii="Arial" w:hAnsi="Arial"/>
+                <w:b w:val="0"/>
+                <w:i w:val="0"/>
+                <w:sz w:val="16"/>
+              </w:rPr>
+              <w:t>Conector de Power BI para SAP Datasphere (o conector de SAP HANA sobre el endpoint SQL/Open SQL del Space, o vía OData).</w:t>
+            </w:r>
+          </w:p>
+        </w:tc>
+        <w:tc>
+          <w:tcPr>
+            <w:tcW w:type="dxa" w:w="2592"/>
+            <w:vAlign w:val="center"/>
+            <w:tcMar>
+              <w:top w:w="40" w:type="dxa"/>
+              <w:bottom w:w="40" w:type="dxa"/>
+              <w:start w:w="80" w:type="dxa"/>
+              <w:end w:w="80" w:type="dxa"/>
+            </w:tcMar>
+          </w:tcPr>
+          <w:p>
+            <w:pPr>
+              <w:spacing w:after="20" w:before="20"/>
+              <w:jc w:val="left"/>
+            </w:pPr>
+            <w:r>
+              <w:rPr>
+                <w:rFonts w:ascii="Arial" w:hAnsi="Arial"/>
+                <w:b w:val="0"/>
+                <w:i w:val="0"/>
+                <w:sz w:val="16"/>
+              </w:rPr>
+              <w:t>Informes y dashboards de Real vs. Presupuesto.</w:t>
+            </w:r>
+          </w:p>
+        </w:tc>
+      </w:tr>
+      <w:tr>
+        <w:tc>
+          <w:tcPr>
+            <w:tcW w:type="dxa" w:w="2160"/>
+            <w:vAlign w:val="center"/>
+            <w:tcMar>
+              <w:top w:w="40" w:type="dxa"/>
+              <w:bottom w:w="40" w:type="dxa"/>
+              <w:start w:w="80" w:type="dxa"/>
+              <w:end w:w="80" w:type="dxa"/>
+            </w:tcMar>
+            <w:shd w:val="clear" w:color="auto" w:fill="F2F6FC"/>
+          </w:tcPr>
+          <w:p>
+            <w:pPr>
+              <w:spacing w:after="20" w:before="20"/>
+              <w:jc w:val="left"/>
+            </w:pPr>
+            <w:r>
+              <w:rPr>
+                <w:rFonts w:ascii="Arial" w:hAnsi="Arial"/>
+                <w:b w:val="0"/>
+                <w:i w:val="0"/>
+                <w:sz w:val="16"/>
+              </w:rPr>
+              <w:t>SAP Analytics Cloud (SAC)</w:t>
+            </w:r>
+          </w:p>
+        </w:tc>
+        <w:tc>
+          <w:tcPr>
+            <w:tcW w:type="dxa" w:w="4752"/>
+            <w:vAlign w:val="center"/>
+            <w:tcMar>
+              <w:top w:w="40" w:type="dxa"/>
+              <w:bottom w:w="40" w:type="dxa"/>
+              <w:start w:w="80" w:type="dxa"/>
+              <w:end w:w="80" w:type="dxa"/>
+            </w:tcMar>
+            <w:shd w:val="clear" w:color="auto" w:fill="F2F6FC"/>
+          </w:tcPr>
+          <w:p>
+            <w:pPr>
+              <w:spacing w:after="20" w:before="20"/>
+              <w:jc w:val="left"/>
+            </w:pPr>
+            <w:r>
+              <w:rPr>
+                <w:rFonts w:ascii="Arial" w:hAnsi="Arial"/>
+                <w:b w:val="0"/>
+                <w:i w:val="0"/>
+                <w:sz w:val="16"/>
+              </w:rPr>
+              <w:t>Conexión en vivo (live) al modelo/vista de Datasphere.</w:t>
+            </w:r>
+          </w:p>
+        </w:tc>
+        <w:tc>
+          <w:tcPr>
+            <w:tcW w:type="dxa" w:w="2592"/>
+            <w:vAlign w:val="center"/>
+            <w:tcMar>
+              <w:top w:w="40" w:type="dxa"/>
+              <w:bottom w:w="40" w:type="dxa"/>
+              <w:start w:w="80" w:type="dxa"/>
+              <w:end w:w="80" w:type="dxa"/>
+            </w:tcMar>
+            <w:shd w:val="clear" w:color="auto" w:fill="F2F6FC"/>
+          </w:tcPr>
+          <w:p>
+            <w:pPr>
+              <w:spacing w:after="20" w:before="20"/>
+              <w:jc w:val="left"/>
+            </w:pPr>
+            <w:r>
+              <w:rPr>
+                <w:rFonts w:ascii="Arial" w:hAnsi="Arial"/>
+                <w:b w:val="0"/>
+                <w:i w:val="0"/>
+                <w:sz w:val="16"/>
+              </w:rPr>
+              <w:t>Historias y análisis reutilizando el modelo semántico.</w:t>
+            </w:r>
+          </w:p>
+        </w:tc>
+      </w:tr>
+    </w:tbl>
+    <w:p>
+      <w:pPr>
+        <w:spacing w:after="80" w:before="0"/>
+      </w:pPr>
+    </w:p>
+    <w:tbl>
+      <w:tblPr>
+        <w:tblStyle w:val="TableGrid"/>
+        <w:tblW w:type="auto" w:w="0"/>
+        <w:jc w:val="center"/>
+        <w:tblLayout w:type="fixed"/>
+        <w:tblLook w:firstColumn="1" w:firstRow="1" w:lastColumn="0" w:lastRow="0" w:noHBand="0" w:noVBand="1" w:val="04A0"/>
+        <w:tblLayout w:type="fixed"/>
+        <w:tblBorders>
+          <w:top w:val="single" w:sz="8" w:space="0" w:color="2E5496"/>
+          <w:left w:val="single" w:sz="8" w:space="0" w:color="2E5496"/>
+          <w:bottom w:val="single" w:sz="8" w:space="0" w:color="2E5496"/>
+          <w:right w:val="single" w:sz="8" w:space="0" w:color="2E5496"/>
+          <w:insideH w:val="single" w:sz="8" w:space="0" w:color="2E5496"/>
+          <w:insideV w:val="single" w:sz="8" w:space="0" w:color="2E5496"/>
+        </w:tblBorders>
+      </w:tblPr>
+      <w:tblGrid>
+        <w:gridCol w:w="9506"/>
+      </w:tblGrid>
+      <w:tr>
+        <w:tc>
+          <w:tcPr>
+            <w:tcW w:type="dxa" w:w="9504"/>
+            <w:shd w:val="clear" w:color="auto" w:fill="2E5496"/>
+            <w:vAlign w:val="center"/>
+            <w:tcMar>
+              <w:top w:w="50" w:type="dxa"/>
+              <w:bottom w:w="50" w:type="dxa"/>
+              <w:start w:w="80" w:type="dxa"/>
+              <w:end w:w="80" w:type="dxa"/>
+            </w:tcMar>
+          </w:tcPr>
+          <w:p>
+            <w:pPr>
+              <w:spacing w:after="20" w:before="20"/>
+              <w:jc w:val="left"/>
+            </w:pPr>
+            <w:r>
+              <w:rPr>
+                <w:rFonts w:ascii="Arial" w:hAnsi="Arial"/>
+                <w:b/>
+                <w:i w:val="0"/>
+                <w:color w:val="FFFFFF"/>
+                <w:sz w:val="18"/>
+              </w:rPr>
+              <w:t>●  Beneficio</w:t>
+            </w:r>
+          </w:p>
+        </w:tc>
+      </w:tr>
+      <w:tr>
+        <w:tc>
+          <w:tcPr>
+            <w:tcW w:type="dxa" w:w="9504"/>
+            <w:shd w:val="clear" w:color="auto" w:fill="EAF1FB"/>
+            <w:vAlign w:val="center"/>
+            <w:tcMar>
+              <w:top w:w="60" w:type="dxa"/>
+              <w:bottom w:w="60" w:type="dxa"/>
+              <w:start w:w="80" w:type="dxa"/>
+              <w:end w:w="80" w:type="dxa"/>
+            </w:tcMar>
+          </w:tcPr>
+          <w:p>
+            <w:pPr>
+              <w:spacing w:after="40" w:before="0"/>
+            </w:pPr>
+            <w:r>
+              <w:rPr>
+                <w:rFonts w:ascii="Arial" w:hAnsi="Arial"/>
+                <w:sz w:val="17"/>
+              </w:rPr>
+              <w:t>Al centralizar presupuesto y real en Datasphere y exponer una única vista, ambos consumos (Power BI y SAC) usan la misma definición de negocio, evitando discrepancias entre reportes.</w:t>
+            </w:r>
+          </w:p>
+        </w:tc>
+      </w:tr>
+    </w:tbl>
+    <w:p>
+      <w:pPr>
+        <w:spacing w:after="120" w:before="0"/>
+      </w:pPr>
+    </w:p>
+    <w:p>
+      <w:pPr>
+        <w:pStyle w:val="Heading1"/>
+        <w:keepNext/>
+        <w:spacing w:before="280" w:after="120"/>
+      </w:pPr>
+      <w:r>
+        <w:t>Comparación de las opciones de carga</w:t>
       </w:r>
     </w:p>
     <w:tbl>
@@ -8051,7 +9567,7 @@
                 <w:i w:val="0"/>
                 <w:sz w:val="16"/>
               </w:rPr>
-              <w:t>Usuario de BD / entorno Python</w:t>
+              <w:t>Usuario de BD / Python</w:t>
             </w:r>
           </w:p>
         </w:tc>
@@ -8414,7 +9930,7 @@
                 <w:i w:val="0"/>
                 <w:sz w:val="16"/>
               </w:rPr>
-              <w:t>Piloto / cargas puntuales</w:t>
+              <w:t>Piloto / puntual</w:t>
             </w:r>
           </w:p>
         </w:tc>
@@ -8441,7 +9957,7 @@
                 <w:i w:val="0"/>
                 <w:sz w:val="16"/>
               </w:rPr>
-              <w:t>Operación recurrente</w:t>
+              <w:t>Operación recurrente ★</w:t>
             </w:r>
           </w:p>
         </w:tc>
@@ -8506,113 +10022,21 @@
         <w:spacing w:after="80" w:before="0"/>
       </w:pPr>
     </w:p>
-    <w:tbl>
-      <w:tblPr>
-        <w:tblStyle w:val="TableGrid"/>
-        <w:tblW w:type="auto" w:w="0"/>
-        <w:jc w:val="center"/>
-        <w:tblLayout w:type="fixed"/>
-        <w:tblLook w:firstColumn="1" w:firstRow="1" w:lastColumn="0" w:lastRow="0" w:noHBand="0" w:noVBand="1" w:val="04A0"/>
-        <w:tblLayout w:type="fixed"/>
-        <w:tblBorders>
-          <w:top w:val="single" w:sz="8" w:space="0" w:color="1F3864"/>
-          <w:left w:val="single" w:sz="8" w:space="0" w:color="1F3864"/>
-          <w:bottom w:val="single" w:sz="8" w:space="0" w:color="1F3864"/>
-          <w:right w:val="single" w:sz="8" w:space="0" w:color="1F3864"/>
-          <w:insideH w:val="single" w:sz="8" w:space="0" w:color="1F3864"/>
-          <w:insideV w:val="single" w:sz="8" w:space="0" w:color="1F3864"/>
-        </w:tblBorders>
-      </w:tblPr>
-      <w:tblGrid>
-        <w:gridCol w:w="9506"/>
-      </w:tblGrid>
-      <w:tr>
-        <w:tc>
-          <w:tcPr>
-            <w:tcW w:type="dxa" w:w="9504"/>
-            <w:shd w:val="clear" w:color="auto" w:fill="1F3864"/>
-            <w:vAlign w:val="center"/>
-            <w:tcMar>
-              <w:top w:w="50" w:type="dxa"/>
-              <w:bottom w:w="50" w:type="dxa"/>
-              <w:start w:w="80" w:type="dxa"/>
-              <w:end w:w="80" w:type="dxa"/>
-            </w:tcMar>
-          </w:tcPr>
-          <w:p>
-            <w:pPr>
-              <w:spacing w:after="20" w:before="20"/>
-              <w:jc w:val="left"/>
-            </w:pPr>
-            <w:r>
-              <w:rPr>
-                <w:rFonts w:ascii="Arial" w:hAnsi="Arial"/>
-                <w:b/>
-                <w:i w:val="0"/>
-                <w:color w:val="FFFFFF"/>
-                <w:sz w:val="18"/>
-              </w:rPr>
-              <w:t>★  Recomendación</w:t>
-            </w:r>
-          </w:p>
-        </w:tc>
-      </w:tr>
-      <w:tr>
-        <w:tc>
-          <w:tcPr>
-            <w:tcW w:type="dxa" w:w="9504"/>
-            <w:shd w:val="clear" w:color="auto" w:fill="EAF1FB"/>
-            <w:vAlign w:val="center"/>
-            <w:tcMar>
-              <w:top w:w="60" w:type="dxa"/>
-              <w:bottom w:w="60" w:type="dxa"/>
-              <w:start w:w="80" w:type="dxa"/>
-              <w:end w:w="80" w:type="dxa"/>
-            </w:tcMar>
-          </w:tcPr>
-          <w:p>
-            <w:pPr>
-              <w:spacing w:after="40" w:before="0"/>
-            </w:pPr>
-            <w:r>
-              <w:rPr>
-                <w:rFonts w:ascii="Arial" w:hAnsi="Arial"/>
-                <w:sz w:val="17"/>
-              </w:rPr>
-              <w:t>▸  Para arrancar rápido y validar el modelo: Propuesta 1 (carga manual) como primera carga o piloto.</w:t>
-            </w:r>
-          </w:p>
-          <w:p>
-            <w:pPr>
-              <w:spacing w:after="40" w:before="0"/>
-            </w:pPr>
-            <w:r>
-              <w:rPr>
-                <w:rFonts w:ascii="Arial" w:hAnsi="Arial"/>
-                <w:sz w:val="17"/>
-              </w:rPr>
-              <w:t>▸  Para la operación recurrente del presupuesto comercial: Propuesta 2 (Cloud Storage + Replication Flow), por su automatización, trazabilidad y bajo acoplamiento con el negocio.</w:t>
-            </w:r>
-          </w:p>
-          <w:p>
-            <w:pPr>
-              <w:spacing w:after="40" w:before="0"/>
-            </w:pPr>
-            <w:r>
-              <w:rPr>
-                <w:rFonts w:ascii="Arial" w:hAnsi="Arial"/>
-                <w:sz w:val="17"/>
-              </w:rPr>
-              <w:t>▸  Si se requiere lógica de validación/normalización (matriz de aplicabilidad, pivoteo de meses) o integración con otros procesos: Propuesta 3 (Open SQL + Python).</w:t>
-            </w:r>
-          </w:p>
-        </w:tc>
-      </w:tr>
-    </w:tbl>
     <w:p>
       <w:pPr>
-        <w:spacing w:after="120" w:before="0"/>
-      </w:pPr>
+        <w:spacing w:after="120"/>
+        <w:jc w:val="both"/>
+      </w:pPr>
+      <w:r>
+        <w:rPr>
+          <w:rFonts w:ascii="Arial" w:hAnsi="Arial"/>
+          <w:b w:val="0"/>
+          <w:i/>
+          <w:color w:val="595959"/>
+          <w:sz w:val="18"/>
+        </w:rPr>
+        <w:t>★ La Propuesta 2 es la base de la opción recomendada para la operación recurrente.</w:t>
+      </w:r>
     </w:p>
     <w:p>
       <w:pPr>
@@ -8644,7 +10068,7 @@
         </w:trPr>
         <w:tc>
           <w:tcPr>
-            <w:tcW w:type="dxa" w:w="2448"/>
+            <w:tcW w:type="dxa" w:w="2592"/>
             <w:shd w:val="clear" w:color="auto" w:fill="1F3864"/>
             <w:vAlign w:val="center"/>
             <w:tcMar>
@@ -8673,7 +10097,7 @@
         </w:tc>
         <w:tc>
           <w:tcPr>
-            <w:tcW w:type="dxa" w:w="7056"/>
+            <w:tcW w:type="dxa" w:w="6912"/>
             <w:shd w:val="clear" w:color="auto" w:fill="1F3864"/>
             <w:vAlign w:val="center"/>
             <w:tcMar>
@@ -8704,7 +10128,7 @@
       <w:tr>
         <w:tc>
           <w:tcPr>
-            <w:tcW w:type="dxa" w:w="2448"/>
+            <w:tcW w:type="dxa" w:w="2592"/>
             <w:vAlign w:val="center"/>
             <w:tcMar>
               <w:top w:w="40" w:type="dxa"/>
@@ -8725,13 +10149,13 @@
                 <w:i w:val="0"/>
                 <w:sz w:val="17"/>
               </w:rPr>
-              <w:t>Calidad del dato</w:t>
-            </w:r>
-          </w:p>
-        </w:tc>
-        <w:tc>
-          <w:tcPr>
-            <w:tcW w:type="dxa" w:w="7056"/>
+              <w:t>Armonización real/presupuesto</w:t>
+            </w:r>
+          </w:p>
+        </w:tc>
+        <w:tc>
+          <w:tcPr>
+            <w:tcW w:type="dxa" w:w="6912"/>
             <w:vAlign w:val="center"/>
             <w:tcMar>
               <w:top w:w="40" w:type="dxa"/>
@@ -8752,7 +10176,7 @@
                 <w:i w:val="0"/>
                 <w:sz w:val="17"/>
               </w:rPr>
-              <w:t>Validar catálogos (sociedad, canal, material…) y tipos antes de cargar; rechazar/registrar filas inválidas.</w:t>
+              <w:t>Alinear sociedad, periodo y llaves comunes (cuenta, material, cliente, centro) para el comparativo Real vs. Presupuesto.</w:t>
             </w:r>
           </w:p>
         </w:tc>
@@ -8760,7 +10184,7 @@
       <w:tr>
         <w:tc>
           <w:tcPr>
-            <w:tcW w:type="dxa" w:w="2448"/>
+            <w:tcW w:type="dxa" w:w="2592"/>
             <w:vAlign w:val="center"/>
             <w:tcMar>
               <w:top w:w="40" w:type="dxa"/>
@@ -8782,13 +10206,13 @@
                 <w:i w:val="0"/>
                 <w:sz w:val="17"/>
               </w:rPr>
-              <w:t>Aplicabilidad por sociedad</w:t>
-            </w:r>
-          </w:p>
-        </w:tc>
-        <w:tc>
-          <w:tcPr>
-            <w:tcW w:type="dxa" w:w="7056"/>
+              <w:t>Modo de integración del real</w:t>
+            </w:r>
+          </w:p>
+        </w:tc>
+        <w:tc>
+          <w:tcPr>
+            <w:tcW w:type="dxa" w:w="6912"/>
             <w:vAlign w:val="center"/>
             <w:tcMar>
               <w:top w:w="40" w:type="dxa"/>
@@ -8810,7 +10234,7 @@
                 <w:i w:val="0"/>
                 <w:sz w:val="17"/>
               </w:rPr>
-              <w:t>Poblar solo los campos que aplican a cada organización (según la matriz); documentar las excepciones.</w:t>
+              <w:t>Preferir replicación (desempeño y desacople); usar federación si se necesita el dato en tiempo real.</w:t>
             </w:r>
           </w:p>
         </w:tc>
@@ -8818,7 +10242,7 @@
       <w:tr>
         <w:tc>
           <w:tcPr>
-            <w:tcW w:type="dxa" w:w="2448"/>
+            <w:tcW w:type="dxa" w:w="2592"/>
             <w:vAlign w:val="center"/>
             <w:tcMar>
               <w:top w:w="40" w:type="dxa"/>
@@ -8839,13 +10263,13 @@
                 <w:i w:val="0"/>
                 <w:sz w:val="17"/>
               </w:rPr>
-              <w:t>Periodicidad y recarga</w:t>
-            </w:r>
-          </w:p>
-        </w:tc>
-        <w:tc>
-          <w:tcPr>
-            <w:tcW w:type="dxa" w:w="7056"/>
+              <w:t>Calidad del dato</w:t>
+            </w:r>
+          </w:p>
+        </w:tc>
+        <w:tc>
+          <w:tcPr>
+            <w:tcW w:type="dxa" w:w="6912"/>
             <w:vAlign w:val="center"/>
             <w:tcMar>
               <w:top w:w="40" w:type="dxa"/>
@@ -8866,7 +10290,7 @@
                 <w:i w:val="0"/>
                 <w:sz w:val="17"/>
               </w:rPr>
-              <w:t>Definir la frecuencia (mensual/anual) y la estrategia de recarga (reemplazo por periodo o upsert) para evitar duplicados.</w:t>
+              <w:t>Validar catálogos y tipos antes de cargar; registrar/rechazar filas inválidas.</w:t>
             </w:r>
           </w:p>
         </w:tc>
@@ -8874,7 +10298,7 @@
       <w:tr>
         <w:tc>
           <w:tcPr>
-            <w:tcW w:type="dxa" w:w="2448"/>
+            <w:tcW w:type="dxa" w:w="2592"/>
             <w:vAlign w:val="center"/>
             <w:tcMar>
               <w:top w:w="40" w:type="dxa"/>
@@ -8896,13 +10320,13 @@
                 <w:i w:val="0"/>
                 <w:sz w:val="17"/>
               </w:rPr>
-              <w:t>Seguridad</w:t>
-            </w:r>
-          </w:p>
-        </w:tc>
-        <w:tc>
-          <w:tcPr>
-            <w:tcW w:type="dxa" w:w="7056"/>
+              <w:t>Aplicabilidad por sociedad</w:t>
+            </w:r>
+          </w:p>
+        </w:tc>
+        <w:tc>
+          <w:tcPr>
+            <w:tcW w:type="dxa" w:w="6912"/>
             <w:vAlign w:val="center"/>
             <w:tcMar>
               <w:top w:w="40" w:type="dxa"/>
@@ -8924,7 +10348,7 @@
                 <w:i w:val="0"/>
                 <w:sz w:val="17"/>
               </w:rPr>
-              <w:t>Gobernar credenciales de conexiones/usuarios; aplicar control de acceso por Space y por dato en Datasphere.</w:t>
+              <w:t>Poblar solo los campos que aplican a cada organización (según la matriz); documentar excepciones.</w:t>
             </w:r>
           </w:p>
         </w:tc>
@@ -8932,7 +10356,7 @@
       <w:tr>
         <w:tc>
           <w:tcPr>
-            <w:tcW w:type="dxa" w:w="2448"/>
+            <w:tcW w:type="dxa" w:w="2592"/>
             <w:vAlign w:val="center"/>
             <w:tcMar>
               <w:top w:w="40" w:type="dxa"/>
@@ -8953,13 +10377,13 @@
                 <w:i w:val="0"/>
                 <w:sz w:val="17"/>
               </w:rPr>
-              <w:t>Versionado</w:t>
-            </w:r>
-          </w:p>
-        </w:tc>
-        <w:tc>
-          <w:tcPr>
-            <w:tcW w:type="dxa" w:w="7056"/>
+              <w:t>Periodicidad y recarga</w:t>
+            </w:r>
+          </w:p>
+        </w:tc>
+        <w:tc>
+          <w:tcPr>
+            <w:tcW w:type="dxa" w:w="6912"/>
             <w:vAlign w:val="center"/>
             <w:tcMar>
               <w:top w:w="40" w:type="dxa"/>
@@ -8980,7 +10404,7 @@
                 <w:i w:val="0"/>
                 <w:sz w:val="17"/>
               </w:rPr>
-              <w:t>Marcar la versión (p. ej. «Comercial») y la fecha de carga para trazabilidad y comparaciones.</w:t>
+              <w:t>Definir la frecuencia y la estrategia de recarga (reemplazo por periodo o upsert) para evitar duplicados.</w:t>
             </w:r>
           </w:p>
         </w:tc>
@@ -8988,7 +10412,7 @@
       <w:tr>
         <w:tc>
           <w:tcPr>
-            <w:tcW w:type="dxa" w:w="2448"/>
+            <w:tcW w:type="dxa" w:w="2592"/>
             <w:vAlign w:val="center"/>
             <w:tcMar>
               <w:top w:w="40" w:type="dxa"/>
@@ -9010,13 +10434,13 @@
                 <w:i w:val="0"/>
                 <w:sz w:val="17"/>
               </w:rPr>
-              <w:t>Convención de archivos</w:t>
-            </w:r>
-          </w:p>
-        </w:tc>
-        <w:tc>
-          <w:tcPr>
-            <w:tcW w:type="dxa" w:w="7056"/>
+              <w:t>Seguridad</w:t>
+            </w:r>
+          </w:p>
+        </w:tc>
+        <w:tc>
+          <w:tcPr>
+            <w:tcW w:type="dxa" w:w="6912"/>
             <w:vAlign w:val="center"/>
             <w:tcMar>
               <w:top w:w="40" w:type="dxa"/>
@@ -9038,7 +10462,63 @@
                 <w:i w:val="0"/>
                 <w:sz w:val="17"/>
               </w:rPr>
-              <w:t>Nombrar los archivos por sociedad/año/mes para automatizar y auditar la ingesta (Propuestas 2 y 4).</w:t>
+              <w:t>Gobernar credenciales de conexiones/usuarios; aplicar control de acceso por Space y por dato en Datasphere.</w:t>
+            </w:r>
+          </w:p>
+        </w:tc>
+      </w:tr>
+      <w:tr>
+        <w:tc>
+          <w:tcPr>
+            <w:tcW w:type="dxa" w:w="2592"/>
+            <w:vAlign w:val="center"/>
+            <w:tcMar>
+              <w:top w:w="40" w:type="dxa"/>
+              <w:bottom w:w="40" w:type="dxa"/>
+              <w:start w:w="80" w:type="dxa"/>
+              <w:end w:w="80" w:type="dxa"/>
+            </w:tcMar>
+          </w:tcPr>
+          <w:p>
+            <w:pPr>
+              <w:spacing w:after="20" w:before="20"/>
+              <w:jc w:val="left"/>
+            </w:pPr>
+            <w:r>
+              <w:rPr>
+                <w:rFonts w:ascii="Arial" w:hAnsi="Arial"/>
+                <w:b w:val="0"/>
+                <w:i w:val="0"/>
+                <w:sz w:val="17"/>
+              </w:rPr>
+              <w:t>Consumo dual</w:t>
+            </w:r>
+          </w:p>
+        </w:tc>
+        <w:tc>
+          <w:tcPr>
+            <w:tcW w:type="dxa" w:w="6912"/>
+            <w:vAlign w:val="center"/>
+            <w:tcMar>
+              <w:top w:w="40" w:type="dxa"/>
+              <w:bottom w:w="40" w:type="dxa"/>
+              <w:start w:w="80" w:type="dxa"/>
+              <w:end w:w="80" w:type="dxa"/>
+            </w:tcMar>
+          </w:tcPr>
+          <w:p>
+            <w:pPr>
+              <w:spacing w:after="20" w:before="20"/>
+              <w:jc w:val="left"/>
+            </w:pPr>
+            <w:r>
+              <w:rPr>
+                <w:rFonts w:ascii="Arial" w:hAnsi="Arial"/>
+                <w:b w:val="0"/>
+                <w:i w:val="0"/>
+                <w:sz w:val="17"/>
+              </w:rPr>
+              <w:t>Exponer una única vista para que Power BI y SAC usen la misma definición de negocio.</w:t>
             </w:r>
           </w:p>
         </w:tc>
@@ -9070,7 +10550,7 @@
           <w:rFonts w:ascii="Arial" w:hAnsi="Arial"/>
           <w:sz w:val="20"/>
         </w:rPr>
-        <w:t>▪  Confirmar la propuesta a implementar (recomendada: P2 para operación; P1 para el piloto).</w:t>
+        <w:t>▪  Confirmar la opción de carga (recomendada: almacenamiento en la nube + Data Flow programado).</w:t>
       </w:r>
     </w:p>
     <w:p>
@@ -9084,7 +10564,21 @@
           <w:rFonts w:ascii="Arial" w:hAnsi="Arial"/>
           <w:sz w:val="20"/>
         </w:rPr>
-        <w:t>▪  Validar y cerrar el modelo de datos destino (tipos, claves, campos de control).</w:t>
+        <w:t>▪  Configurar la integración del real desde S/4HANA (conexión + Replication Flow).</w:t>
+      </w:r>
+    </w:p>
+    <w:p>
+      <w:pPr>
+        <w:pStyle w:val="ListParagraph"/>
+        <w:spacing w:after="40"/>
+        <w:ind w:left="432"/>
+      </w:pPr>
+      <w:r>
+        <w:rPr>
+          <w:rFonts w:ascii="Arial" w:hAnsi="Arial"/>
+          <w:sz w:val="20"/>
+        </w:rPr>
+        <w:t>▪  Cerrar el modelo de datos destino (tablas Presupuesto y Real, y sus dimensiones comunes).</w:t>
       </w:r>
     </w:p>
     <w:p>
@@ -9112,7 +10606,7 @@
           <w:rFonts w:ascii="Arial" w:hAnsi="Arial"/>
           <w:sz w:val="20"/>
         </w:rPr>
-        <w:t>▪  Construir la tabla, la conexión/flujo (o script) y la vista analítica en Datasphere.</w:t>
+        <w:t>▪  Construir la Tabla Presupuesto, la Tabla Real y la vista Real vs. Presupuesto.</w:t>
       </w:r>
     </w:p>
     <w:p>
@@ -9126,7 +10620,7 @@
           <w:rFonts w:ascii="Arial" w:hAnsi="Arial"/>
           <w:sz w:val="20"/>
         </w:rPr>
-        <w:t>▪  Ejecutar una carga de prueba y conciliar contra el archivo fuente.</w:t>
+        <w:t>▪  Ejecutar cargas de prueba y conciliar contra el archivo y contra S/4HANA.</w:t>
       </w:r>
     </w:p>
     <w:p>
@@ -9140,7 +10634,7 @@
           <w:rFonts w:ascii="Arial" w:hAnsi="Arial"/>
           <w:sz w:val="20"/>
         </w:rPr>
-        <w:t>▪  Conectar el consumo en SAP Analytics Cloud.</w:t>
+        <w:t>▪  Conectar el consumo en Power BI y/o SAC.</w:t>
       </w:r>
     </w:p>
     <w:p>
@@ -9178,7 +10672,7 @@
           <w:rFonts w:ascii="Arial" w:hAnsi="Arial"/>
           <w:sz w:val="20"/>
         </w:rPr>
-        <w:t>▪  Documentación de SAP Datasphere: importación de CSV a tabla local; conexiones de almacenamiento en la nube; Replication Flows y Data Flows; Open SQL Schema / acceso a la base de datos del Space.</w:t>
+        <w:t>▪  SAP Datasphere: importación de CSV a tabla local; conexiones de almacenamiento en la nube; Replication Flows y Data Flows; Open SQL Schema / acceso a la base de datos del Space.</w:t>
       </w:r>
     </w:p>
     <w:p>
@@ -9192,7 +10686,21 @@
           <w:rFonts w:ascii="Arial" w:hAnsi="Arial"/>
           <w:sz w:val="20"/>
         </w:rPr>
-        <w:t>▪  Documentación de SAP Integration Suite (Cloud Integration) para la orquestación de cargas.</w:t>
+        <w:t>▪  SAP Datasphere: integración con SAP S/4HANA (Replication Flow, extracción CDS/ODP, SAP Cloud Connector).</w:t>
+      </w:r>
+    </w:p>
+    <w:p>
+      <w:pPr>
+        <w:pStyle w:val="ListParagraph"/>
+        <w:spacing w:after="40"/>
+        <w:ind w:left="432"/>
+      </w:pPr>
+      <w:r>
+        <w:rPr>
+          <w:rFonts w:ascii="Arial" w:hAnsi="Arial"/>
+          <w:sz w:val="20"/>
+        </w:rPr>
+        <w:t>▪  Conector de Microsoft Power BI para SAP Datasphere; conexión en vivo de SAP Analytics Cloud a Datasphere.</w:t>
       </w:r>
     </w:p>
     <w:sectPr>

</xml_diff>